<commit_message>
Slight change to doc file
</commit_message>
<xml_diff>
--- a/forms/A2_form.docx
+++ b/forms/A2_form.docx
@@ -141,13 +141,8 @@
               <w:spacing w:after="80"/>
             </w:pPr>
             <w:r>
-              <w:t xml:space="preserve">Query from </w:t>
-            </w:r>
-            <w:proofErr w:type="spellStart"/>
-            <w:r>
-              <w:t>seerat</w:t>
-            </w:r>
-            <w:proofErr w:type="spellEnd"/>
+              <w:t>Query from seerat</w:t>
+            </w:r>
           </w:p>
         </w:tc>
       </w:tr>
@@ -577,73 +572,7 @@
               <w:t xml:space="preserve">What to hand in: </w:t>
             </w:r>
             <w:r>
-              <w:t>Push everything to your team's PUBLIC GitHub repo, then tag it: git add -A &amp;&amp; git commit -m "a2-submit" &amp;&amp; git tag a2-submit &amp;&amp; git push origin main --tags. The tag IS your submission (deadlines are read from GitHub's servers) — do NOT upload a ZIP. Contents: the filled form in forms/, the repo with ingest / vision / index stages implemented, the built index (or a script that builds it), notebooks/</w:t>
-            </w:r>
-            <w:proofErr w:type="spellStart"/>
-            <w:r>
-              <w:t>kb_demo.ipynb</w:t>
-            </w:r>
-            <w:proofErr w:type="spellEnd"/>
-            <w:r>
-              <w:t xml:space="preserve"> showing OCR quality and one retrieval example, your updated configs/design_choices.md, and one AI-chat transcript per member. ALSO CARRIED FORWARD FROM A1 — the code stub was released after A1, so these are graded here for the first time: configs/</w:t>
-            </w:r>
-            <w:proofErr w:type="spellStart"/>
-            <w:r>
-              <w:t>task.yaml</w:t>
-            </w:r>
-            <w:proofErr w:type="spellEnd"/>
-            <w:r>
-              <w:t>, data/provenance.md plus your corpus (or scripts/get_data.sh), notebooks/</w:t>
-            </w:r>
-            <w:proofErr w:type="spellStart"/>
-            <w:r>
-              <w:t>eda.ipynb</w:t>
-            </w:r>
-            <w:proofErr w:type="spellEnd"/>
-            <w:r>
-              <w:t xml:space="preserve">, </w:t>
-            </w:r>
-            <w:proofErr w:type="spellStart"/>
-            <w:r>
-              <w:t>grading_kit</w:t>
-            </w:r>
-            <w:proofErr w:type="spellEnd"/>
-            <w:r>
-              <w:t>/</w:t>
-            </w:r>
-            <w:proofErr w:type="spellStart"/>
-            <w:r>
-              <w:t>manifest.yaml</w:t>
-            </w:r>
-            <w:proofErr w:type="spellEnd"/>
-            <w:r>
-              <w:t xml:space="preserve">, and </w:t>
-            </w:r>
-            <w:proofErr w:type="spellStart"/>
-            <w:r>
-              <w:t>grading_kit</w:t>
-            </w:r>
-            <w:proofErr w:type="spellEnd"/>
-            <w:r>
-              <w:t>/</w:t>
-            </w:r>
-            <w:proofErr w:type="spellStart"/>
-            <w:r>
-              <w:t>heldout_pages</w:t>
-            </w:r>
-            <w:proofErr w:type="spellEnd"/>
-            <w:r>
-              <w:t xml:space="preserve">/ with </w:t>
-            </w:r>
-            <w:proofErr w:type="spellStart"/>
-            <w:proofErr w:type="gramStart"/>
-            <w:r>
-              <w:t>labels.jsonl</w:t>
-            </w:r>
-            <w:proofErr w:type="spellEnd"/>
-            <w:proofErr w:type="gramEnd"/>
-            <w:r>
-              <w:t>.</w:t>
+              <w:t>Push everything to your team's PUBLIC GitHub repo, then tag it: git add -A &amp;&amp; git commit -m "a2-submit" &amp;&amp; git tag a2-submit &amp;&amp; git push origin main --tags. The tag IS your submission (deadlines are read from GitHub's servers) — do NOT upload a ZIP. Contents: the filled form in forms/, the repo with ingest / vision / index stages implemented, the built index (or a script that builds it), notebooks/kb_demo.ipynb showing OCR quality and one retrieval example, your updated configs/design_choices.md, and one AI-chat transcript per member. ALSO CARRIED FORWARD FROM A1 — the code stub was released after A1, so these are graded here for the first time: configs/task.yaml, data/provenance.md plus your corpus (or scripts/get_data.sh), notebooks/eda.ipynb, grading_kit/manifest.yaml, and grading_kit/heldout_pages/ with labels.jsonl.</w:t>
             </w:r>
           </w:p>
         </w:tc>
@@ -724,29 +653,7 @@
                 <w:sz w:val="18"/>
                 <w:szCs w:val="18"/>
               </w:rPr>
-              <w:t xml:space="preserve">domain · data </w:t>
-            </w:r>
-            <w:proofErr w:type="spellStart"/>
-            <w:r>
-              <w:rPr>
-                <w:i/>
-                <w:iCs/>
-                <w:color w:val="595959"/>
-                <w:sz w:val="18"/>
-                <w:szCs w:val="18"/>
-              </w:rPr>
-              <w:t>speciality</w:t>
-            </w:r>
-            <w:proofErr w:type="spellEnd"/>
-            <w:r>
-              <w:rPr>
-                <w:i/>
-                <w:iCs/>
-                <w:color w:val="595959"/>
-                <w:sz w:val="18"/>
-                <w:szCs w:val="18"/>
-              </w:rPr>
-              <w:t xml:space="preserve"> · primary NFR + target — one line each.</w:t>
+              <w:t>domain · data speciality · primary NFR + target — one line each.</w:t>
             </w:r>
           </w:p>
         </w:tc>
@@ -775,27 +682,11 @@
               <w:spacing w:after="80"/>
             </w:pPr>
             <w:r>
-              <w:t>People who would use the tool: Students of knowledge i.e. People of Islamic faith, who wish to understand the biography of the life of the Prophet (</w:t>
-            </w:r>
-            <w:proofErr w:type="spellStart"/>
-            <w:r>
-              <w:t>pbuh</w:t>
-            </w:r>
-            <w:proofErr w:type="spellEnd"/>
-            <w:r>
-              <w:t>) and apply the teachings in their own life.</w:t>
+              <w:t>People who would use the tool: Students of knowledge i.e. People of Islamic faith, who wish to understand the biography of the life of the Prophet (pbuh) and apply the teachings in their own life.</w:t>
             </w:r>
             <w:r>
               <w:br/>
-              <w:t xml:space="preserve">The data </w:t>
-            </w:r>
-            <w:proofErr w:type="spellStart"/>
-            <w:r>
-              <w:t>speciality</w:t>
-            </w:r>
-            <w:proofErr w:type="spellEnd"/>
-            <w:r>
-              <w:t xml:space="preserve"> is that our corpus is entirely written in Bangla, and scanned without OCR. The pages are like images, and we have to use OCR to retrieve our data from the corpus.</w:t>
+              <w:t>The data speciality is that our corpus is entirely written in Bangla, and scanned without OCR. The pages are like images, and we have to use OCR to retrieve our data from the corpus.</w:t>
             </w:r>
           </w:p>
           <w:p>
@@ -825,15 +716,7 @@
             </w:pPr>
             <w:r>
               <w:lastRenderedPageBreak/>
-              <w:t>Because the corpus covers religious and historical content regarding the life of the Prophet Muhammad (</w:t>
-            </w:r>
-            <w:proofErr w:type="spellStart"/>
-            <w:r>
-              <w:t>pbuh</w:t>
-            </w:r>
-            <w:proofErr w:type="spellEnd"/>
-            <w:r>
-              <w:t xml:space="preserve">), returning incorrect or ungrounded information is far worse than admitting missing knowledge. Our primary quality optimization is to ensure that when the agent provides an answer, it is strictly accurate and backed by context, targeting a precision of </w:t>
+              <w:t xml:space="preserve">Because the corpus covers religious and historical content regarding the life of the Prophet Muhammad (pbuh), returning incorrect or ungrounded information is far worse than admitting missing knowledge. Our primary quality optimization is to ensure that when the agent provides an answer, it is strictly accurate and backed by context, targeting a precision of </w:t>
             </w:r>
             <m:oMath>
               <m:r>
@@ -985,19 +868,9 @@
               <w:pStyle w:val="normal1"/>
               <w:spacing w:after="80"/>
             </w:pPr>
-            <w:proofErr w:type="spellStart"/>
-            <w:r>
-              <w:t>Ar-Raheequl</w:t>
-            </w:r>
-            <w:proofErr w:type="spellEnd"/>
-            <w:r>
-              <w:t xml:space="preserve"> </w:t>
-            </w:r>
-            <w:proofErr w:type="spellStart"/>
-            <w:r>
-              <w:t>Makhtum</w:t>
-            </w:r>
-            <w:proofErr w:type="spellEnd"/>
+            <w:r>
+              <w:t>Ar-Raheequl Makhtum</w:t>
+            </w:r>
           </w:p>
           <w:p>
             <w:pPr>
@@ -1029,10 +902,7 @@
               <w:t>566910</w:t>
             </w:r>
             <w:r>
-              <w:t xml:space="preserve"> </w:t>
-            </w:r>
-            <w:r>
-              <w:t>words</w:t>
+              <w:t xml:space="preserve"> words</w:t>
             </w:r>
           </w:p>
           <w:p>
@@ -1145,17 +1015,7 @@
               <w:spacing w:after="80"/>
             </w:pPr>
             <w:r>
-              <w:t xml:space="preserve">Most of the page have headers and footer. The header contains the title of the corpus using Bangla font alternatively in Arabic (pronunciation in Bangla) and Bangla. There’s also the page number and there’s a horizontal dashed line indicating that </w:t>
-            </w:r>
-            <w:proofErr w:type="spellStart"/>
-            <w:proofErr w:type="gramStart"/>
-            <w:r>
-              <w:t>its</w:t>
-            </w:r>
-            <w:proofErr w:type="spellEnd"/>
-            <w:proofErr w:type="gramEnd"/>
-            <w:r>
-              <w:t xml:space="preserve"> a header. The vision model can exploit this. Some pages have a footer note for references. Most page have a watermark at the bottom that can be recognized. </w:t>
+              <w:t xml:space="preserve">Most of the page have headers and footer. The header contains the title of the corpus using Bangla font alternatively in Arabic (pronunciation in Bangla) and Bangla. There’s also the page number and there’s a horizontal dashed line indicating that its a header. The vision model can exploit this. Some pages have a footer note for references. Most page have a watermark at the bottom that can be recognized. </w:t>
             </w:r>
           </w:p>
         </w:tc>
@@ -1215,23 +1075,7 @@
               <w:spacing w:after="80"/>
             </w:pPr>
             <w:r>
-              <w:t xml:space="preserve">The reading order is from left to right, gradually downwards from top to bottom. The OCR model can see the </w:t>
-            </w:r>
-            <w:proofErr w:type="spellStart"/>
-            <w:r>
-              <w:t>bengali</w:t>
-            </w:r>
-            <w:proofErr w:type="spellEnd"/>
-            <w:r>
-              <w:t xml:space="preserve"> </w:t>
-            </w:r>
-            <w:proofErr w:type="spellStart"/>
-            <w:r>
-              <w:t>fullstop</w:t>
-            </w:r>
-            <w:proofErr w:type="spellEnd"/>
-            <w:r>
-              <w:t xml:space="preserve"> punctuation (|) and identify sentences for proper contextual meaning.</w:t>
+              <w:t>The reading order is from left to right, gradually downwards from top to bottom. The OCR model can see the bengali fullstop punctuation (|) and identify sentences for proper contextual meaning.</w:t>
             </w:r>
           </w:p>
         </w:tc>
@@ -1291,25 +1135,7 @@
               <w:spacing w:after="80"/>
             </w:pPr>
             <w:r>
-              <w:t xml:space="preserve">There are very mild deformities in the scanned font such as broken or incomplete lines, which when looked at a glance is obvious that there should be a line or curve here (small gaps in the curves and lines). Many sentences span across pages so </w:t>
-            </w:r>
-            <w:proofErr w:type="gramStart"/>
-            <w:r>
-              <w:t>an</w:t>
-            </w:r>
-            <w:proofErr w:type="gramEnd"/>
-            <w:r>
-              <w:t xml:space="preserve"> scan of an incomplete sentence in a page should not break the final output. Some pages have some tilt towards the inner side, as is common with scanned pdfs of books, so some texts have minor skews. This should not </w:t>
-            </w:r>
-            <w:proofErr w:type="spellStart"/>
-            <w:proofErr w:type="gramStart"/>
-            <w:r>
-              <w:t>effect</w:t>
-            </w:r>
-            <w:proofErr w:type="spellEnd"/>
-            <w:proofErr w:type="gramEnd"/>
-            <w:r>
-              <w:t xml:space="preserve"> the final output.</w:t>
+              <w:t>There are very mild deformities in the scanned font such as broken or incomplete lines, which when looked at a glance is obvious that there should be a line or curve here (small gaps in the curves and lines). Many sentences span across pages so an scan of an incomplete sentence in a page should not break the final output. Some pages have some tilt towards the inner side, as is common with scanned pdfs of books, so some texts have minor skews. This should not effect the final output.</w:t>
             </w:r>
           </w:p>
         </w:tc>
@@ -1595,9 +1421,90 @@
                 <w:sz w:val="18"/>
                 <w:szCs w:val="18"/>
               </w:rPr>
-              <w:t xml:space="preserve">Heuristic contour finding vs. YOLO-based object detection (e.g., </w:t>
-            </w:r>
-            <w:proofErr w:type="spellStart"/>
+              <w:t>Heuristic contour finding vs. YOLO-based object detection (e.g., LayoutLM).</w:t>
+            </w:r>
+          </w:p>
+        </w:tc>
+        <w:tc>
+          <w:tcPr>
+            <w:tcW w:w="3199" w:type="dxa"/>
+            <w:tcBorders>
+              <w:top w:val="single" w:sz="4" w:space="0" w:color="000000"/>
+              <w:left w:val="single" w:sz="4" w:space="0" w:color="000000"/>
+              <w:bottom w:val="single" w:sz="4" w:space="0" w:color="000000"/>
+              <w:right w:val="single" w:sz="4" w:space="0" w:color="000000"/>
+            </w:tcBorders>
+          </w:tcPr>
+          <w:p>
+            <w:pPr>
+              <w:spacing w:after="80"/>
+            </w:pPr>
+            <w:r>
+              <w:rPr>
+                <w:b/>
+                <w:bCs/>
+              </w:rPr>
+              <w:t>YOLOv8 (hantian/yolo-doclaynet):</w:t>
+            </w:r>
+            <w:r>
+              <w:t xml:space="preserve"> Heuristics fail on complex book pages. This model accurately classifies text, tables, figures, and helps us filter out headers</w:t>
+            </w:r>
+          </w:p>
+        </w:tc>
+        <w:tc>
+          <w:tcPr>
+            <w:tcW w:w="1561" w:type="dxa"/>
+            <w:tcBorders>
+              <w:top w:val="single" w:sz="4" w:space="0" w:color="000000"/>
+              <w:left w:val="single" w:sz="4" w:space="0" w:color="000000"/>
+              <w:bottom w:val="single" w:sz="4" w:space="0" w:color="000000"/>
+              <w:right w:val="single" w:sz="4" w:space="0" w:color="000000"/>
+            </w:tcBorders>
+          </w:tcPr>
+          <w:p>
+            <w:pPr>
+              <w:spacing w:after="80"/>
+            </w:pPr>
+            <w:r>
+              <w:t>No</w:t>
+            </w:r>
+          </w:p>
+        </w:tc>
+      </w:tr>
+      <w:tr>
+        <w:tc>
+          <w:tcPr>
+            <w:tcW w:w="1699" w:type="dxa"/>
+            <w:tcBorders>
+              <w:top w:val="single" w:sz="4" w:space="0" w:color="000000"/>
+              <w:left w:val="single" w:sz="4" w:space="0" w:color="000000"/>
+              <w:bottom w:val="single" w:sz="4" w:space="0" w:color="000000"/>
+              <w:right w:val="single" w:sz="4" w:space="0" w:color="000000"/>
+            </w:tcBorders>
+          </w:tcPr>
+          <w:p>
+            <w:pPr>
+              <w:spacing w:after="80"/>
+            </w:pPr>
+            <w:r>
+              <w:t>OCR / HTR</w:t>
+            </w:r>
+          </w:p>
+        </w:tc>
+        <w:tc>
+          <w:tcPr>
+            <w:tcW w:w="2901" w:type="dxa"/>
+            <w:tcBorders>
+              <w:top w:val="single" w:sz="4" w:space="0" w:color="000000"/>
+              <w:left w:val="single" w:sz="4" w:space="0" w:color="000000"/>
+              <w:bottom w:val="single" w:sz="4" w:space="0" w:color="000000"/>
+              <w:right w:val="single" w:sz="4" w:space="0" w:color="000000"/>
+            </w:tcBorders>
+          </w:tcPr>
+          <w:p>
+            <w:pPr>
+              <w:spacing w:after="80"/>
+            </w:pPr>
             <w:r>
               <w:rPr>
                 <w:i/>
@@ -1606,9 +1513,94 @@
                 <w:sz w:val="18"/>
                 <w:szCs w:val="18"/>
               </w:rPr>
-              <w:t>LayoutLM</w:t>
-            </w:r>
-            <w:proofErr w:type="spellEnd"/>
+              <w:t>Base Tesseract vs. TrOCR vs. Fine-tuned Tesseract.</w:t>
+            </w:r>
+          </w:p>
+        </w:tc>
+        <w:tc>
+          <w:tcPr>
+            <w:tcW w:w="3199" w:type="dxa"/>
+            <w:tcBorders>
+              <w:top w:val="single" w:sz="4" w:space="0" w:color="000000"/>
+              <w:left w:val="single" w:sz="4" w:space="0" w:color="000000"/>
+              <w:bottom w:val="single" w:sz="4" w:space="0" w:color="000000"/>
+              <w:right w:val="single" w:sz="4" w:space="0" w:color="000000"/>
+            </w:tcBorders>
+          </w:tcPr>
+          <w:p>
+            <w:pPr>
+              <w:spacing w:after="80"/>
+              <w:jc w:val="center"/>
+            </w:pPr>
+            <w:r>
+              <w:rPr>
+                <w:b/>
+                <w:bCs/>
+              </w:rPr>
+              <w:t>Fine-tuned Tesseract (ben_seerah):</w:t>
+            </w:r>
+            <w:r>
+              <w:t xml:space="preserve"> Base models struggle with Bengali conjuncts in this specific historical font. We adapted a custom traineddata model</w:t>
+            </w:r>
+            <w:r>
+              <w:t>, its performance was slightly better than base model. And, TrOCR was terrible for Bangla language</w:t>
+            </w:r>
+          </w:p>
+        </w:tc>
+        <w:tc>
+          <w:tcPr>
+            <w:tcW w:w="1561" w:type="dxa"/>
+            <w:tcBorders>
+              <w:top w:val="single" w:sz="4" w:space="0" w:color="000000"/>
+              <w:left w:val="single" w:sz="4" w:space="0" w:color="000000"/>
+              <w:bottom w:val="single" w:sz="4" w:space="0" w:color="000000"/>
+              <w:right w:val="single" w:sz="4" w:space="0" w:color="000000"/>
+            </w:tcBorders>
+          </w:tcPr>
+          <w:p>
+            <w:pPr>
+              <w:spacing w:after="80"/>
+            </w:pPr>
+            <w:r>
+              <w:t>Yes</w:t>
+            </w:r>
+          </w:p>
+        </w:tc>
+      </w:tr>
+      <w:tr>
+        <w:tc>
+          <w:tcPr>
+            <w:tcW w:w="1699" w:type="dxa"/>
+            <w:tcBorders>
+              <w:top w:val="single" w:sz="4" w:space="0" w:color="000000"/>
+              <w:left w:val="single" w:sz="4" w:space="0" w:color="000000"/>
+              <w:bottom w:val="single" w:sz="4" w:space="0" w:color="000000"/>
+              <w:right w:val="single" w:sz="4" w:space="0" w:color="000000"/>
+            </w:tcBorders>
+          </w:tcPr>
+          <w:p>
+            <w:pPr>
+              <w:spacing w:after="80"/>
+            </w:pPr>
+            <w:r>
+              <w:t>Chunking</w:t>
+            </w:r>
+          </w:p>
+        </w:tc>
+        <w:tc>
+          <w:tcPr>
+            <w:tcW w:w="2901" w:type="dxa"/>
+            <w:tcBorders>
+              <w:top w:val="single" w:sz="4" w:space="0" w:color="000000"/>
+              <w:left w:val="single" w:sz="4" w:space="0" w:color="000000"/>
+              <w:bottom w:val="single" w:sz="4" w:space="0" w:color="000000"/>
+              <w:right w:val="single" w:sz="4" w:space="0" w:color="000000"/>
+            </w:tcBorders>
+          </w:tcPr>
+          <w:p>
+            <w:pPr>
+              <w:spacing w:after="80"/>
+            </w:pPr>
             <w:r>
               <w:rPr>
                 <w:i/>
@@ -1617,7 +1609,7 @@
                 <w:sz w:val="18"/>
                 <w:szCs w:val="18"/>
               </w:rPr>
-              <w:t>).</w:t>
+              <w:t>Fixed character length vs. Semantic recursive splitting</w:t>
             </w:r>
           </w:p>
         </w:tc>
@@ -1640,42 +1632,10 @@
                 <w:b/>
                 <w:bCs/>
               </w:rPr>
-              <w:t>YOLOv8 (</w:t>
-            </w:r>
-            <w:proofErr w:type="spellStart"/>
-            <w:r>
-              <w:rPr>
-                <w:b/>
-                <w:bCs/>
-              </w:rPr>
-              <w:t>hantian</w:t>
-            </w:r>
-            <w:proofErr w:type="spellEnd"/>
-            <w:r>
-              <w:rPr>
-                <w:b/>
-                <w:bCs/>
-              </w:rPr>
-              <w:t>/yolo-</w:t>
-            </w:r>
-            <w:proofErr w:type="spellStart"/>
-            <w:r>
-              <w:rPr>
-                <w:b/>
-                <w:bCs/>
-              </w:rPr>
-              <w:t>doclaynet</w:t>
-            </w:r>
-            <w:proofErr w:type="spellEnd"/>
-            <w:r>
-              <w:rPr>
-                <w:b/>
-                <w:bCs/>
-              </w:rPr>
-              <w:t>):</w:t>
-            </w:r>
-            <w:r>
-              <w:t xml:space="preserve"> Heuristics fail on complex book pages. This model accurately classifies text, tables, figures, and helps us filter out headers</w:t>
+              <w:t>Recursive character splitting:</w:t>
+            </w:r>
+            <w:r>
+              <w:t xml:space="preserve"> Adheres strictly to the Chunk contract. Uses sequential fallbacks (\n\n, \n, space) to avoid breaking sentences while maintaining a max token size of 500 and overlap of 50.</w:t>
             </w:r>
           </w:p>
         </w:tc>
@@ -1715,7 +1675,7 @@
               <w:spacing w:after="80"/>
             </w:pPr>
             <w:r>
-              <w:t>OCR / HTR</w:t>
+              <w:t>Embedding</w:t>
             </w:r>
           </w:p>
         </w:tc>
@@ -1741,9 +1701,8 @@
                 <w:sz w:val="18"/>
                 <w:szCs w:val="18"/>
               </w:rPr>
-              <w:t xml:space="preserve">Base Tesseract vs. </w:t>
-            </w:r>
-            <w:proofErr w:type="spellStart"/>
+              <w:t>all-MiniLM-L6-v2 vs. Multilingual Sentence Transformers</w:t>
+            </w:r>
             <w:r>
               <w:rPr>
                 <w:i/>
@@ -1752,9 +1711,11 @@
                 <w:sz w:val="18"/>
                 <w:szCs w:val="18"/>
               </w:rPr>
-              <w:t>TrOCR</w:t>
-            </w:r>
-            <w:proofErr w:type="spellEnd"/>
+              <w:t xml:space="preserve"> such as </w:t>
+            </w:r>
+            <w:r>
+              <w:t>paraphrase-multilingual-MiniLM-L12-v2</w:t>
+            </w:r>
             <w:r>
               <w:rPr>
                 <w:i/>
@@ -1763,7 +1724,7 @@
                 <w:sz w:val="18"/>
                 <w:szCs w:val="18"/>
               </w:rPr>
-              <w:t xml:space="preserve"> vs. Fine-tuned Tesseract.</w:t>
+              <w:t>.</w:t>
             </w:r>
           </w:p>
         </w:tc>
@@ -1780,52 +1741,23 @@
           <w:p>
             <w:pPr>
               <w:spacing w:after="80"/>
-              <w:jc w:val="center"/>
             </w:pPr>
             <w:r>
               <w:rPr>
                 <w:b/>
                 <w:bCs/>
               </w:rPr>
-              <w:t>Fine-tuned Tesseract (</w:t>
-            </w:r>
-            <w:proofErr w:type="spellStart"/>
+              <w:t>paraphrase-multilingual-MiniLM-L12-v2</w:t>
+            </w:r>
             <w:r>
               <w:rPr>
                 <w:b/>
                 <w:bCs/>
               </w:rPr>
-              <w:t>ben_seerah</w:t>
-            </w:r>
-            <w:proofErr w:type="spellEnd"/>
-            <w:r>
-              <w:rPr>
-                <w:b/>
-                <w:bCs/>
-              </w:rPr>
-              <w:t>):</w:t>
-            </w:r>
-            <w:r>
-              <w:t xml:space="preserve"> Base models struggle with Bengali conjuncts in this specific historical font. We adapted a custom </w:t>
-            </w:r>
-            <w:proofErr w:type="spellStart"/>
-            <w:r>
-              <w:t>traineddata</w:t>
-            </w:r>
-            <w:proofErr w:type="spellEnd"/>
-            <w:r>
-              <w:t xml:space="preserve"> model</w:t>
-            </w:r>
-            <w:r>
-              <w:t xml:space="preserve">, its performance was slightly better than base model. And, </w:t>
-            </w:r>
-            <w:proofErr w:type="spellStart"/>
-            <w:r>
-              <w:t>TrOCR</w:t>
-            </w:r>
-            <w:proofErr w:type="spellEnd"/>
-            <w:r>
-              <w:t xml:space="preserve"> was terrible for Bangla language</w:t>
+              <w:t xml:space="preserve">: </w:t>
+            </w:r>
+            <w:r>
+              <w:t>because all-MiniLM-L6-v2 is primary for English only!</w:t>
             </w:r>
           </w:p>
         </w:tc>
@@ -1844,7 +1776,7 @@
               <w:spacing w:after="80"/>
             </w:pPr>
             <w:r>
-              <w:t>Yes</w:t>
+              <w:t>No</w:t>
             </w:r>
           </w:p>
         </w:tc>
@@ -1865,7 +1797,7 @@
               <w:spacing w:after="80"/>
             </w:pPr>
             <w:r>
-              <w:t>Chunking</w:t>
+              <w:t>Vector index</w:t>
             </w:r>
           </w:p>
         </w:tc>
@@ -1891,7 +1823,7 @@
                 <w:sz w:val="18"/>
                 <w:szCs w:val="18"/>
               </w:rPr>
-              <w:t>Fixed character length vs. Semantic recursive splitting</w:t>
+              <w:t>FAISS Flat L2 vs. FAISS HNSW.</w:t>
             </w:r>
           </w:p>
         </w:tc>
@@ -1914,237 +1846,7 @@
                 <w:b/>
                 <w:bCs/>
               </w:rPr>
-              <w:t>Recursive character splitting:</w:t>
-            </w:r>
-            <w:r>
-              <w:t xml:space="preserve"> Adheres strictly to the Chunk contract. Uses sequential fallbacks (\n\n, \n, space) to avoid breaking sentences while maintaining a max token size of 500 and overlap of 50.</w:t>
-            </w:r>
-          </w:p>
-        </w:tc>
-        <w:tc>
-          <w:tcPr>
-            <w:tcW w:w="1561" w:type="dxa"/>
-            <w:tcBorders>
-              <w:top w:val="single" w:sz="4" w:space="0" w:color="000000"/>
-              <w:left w:val="single" w:sz="4" w:space="0" w:color="000000"/>
-              <w:bottom w:val="single" w:sz="4" w:space="0" w:color="000000"/>
-              <w:right w:val="single" w:sz="4" w:space="0" w:color="000000"/>
-            </w:tcBorders>
-          </w:tcPr>
-          <w:p>
-            <w:pPr>
-              <w:spacing w:after="80"/>
-            </w:pPr>
-            <w:r>
-              <w:t>No</w:t>
-            </w:r>
-          </w:p>
-        </w:tc>
-      </w:tr>
-      <w:tr>
-        <w:tc>
-          <w:tcPr>
-            <w:tcW w:w="1699" w:type="dxa"/>
-            <w:tcBorders>
-              <w:top w:val="single" w:sz="4" w:space="0" w:color="000000"/>
-              <w:left w:val="single" w:sz="4" w:space="0" w:color="000000"/>
-              <w:bottom w:val="single" w:sz="4" w:space="0" w:color="000000"/>
-              <w:right w:val="single" w:sz="4" w:space="0" w:color="000000"/>
-            </w:tcBorders>
-          </w:tcPr>
-          <w:p>
-            <w:pPr>
-              <w:spacing w:after="80"/>
-            </w:pPr>
-            <w:r>
-              <w:t>Embedding</w:t>
-            </w:r>
-          </w:p>
-        </w:tc>
-        <w:tc>
-          <w:tcPr>
-            <w:tcW w:w="2901" w:type="dxa"/>
-            <w:tcBorders>
-              <w:top w:val="single" w:sz="4" w:space="0" w:color="000000"/>
-              <w:left w:val="single" w:sz="4" w:space="0" w:color="000000"/>
-              <w:bottom w:val="single" w:sz="4" w:space="0" w:color="000000"/>
-              <w:right w:val="single" w:sz="4" w:space="0" w:color="000000"/>
-            </w:tcBorders>
-          </w:tcPr>
-          <w:p>
-            <w:pPr>
-              <w:spacing w:after="80"/>
-            </w:pPr>
-            <w:r>
-              <w:rPr>
-                <w:i/>
-                <w:iCs/>
-                <w:color w:val="595959"/>
-                <w:sz w:val="18"/>
-                <w:szCs w:val="18"/>
-              </w:rPr>
-              <w:t>all-MiniLM-L6-v2 vs. Multilingual Sentence Transformers</w:t>
-            </w:r>
-            <w:r>
-              <w:rPr>
-                <w:i/>
-                <w:iCs/>
-                <w:color w:val="595959"/>
-                <w:sz w:val="18"/>
-                <w:szCs w:val="18"/>
-              </w:rPr>
-              <w:t xml:space="preserve"> such as </w:t>
-            </w:r>
-            <w:r>
-              <w:t>paraphrase-multilingual-MiniLM-L12-v2</w:t>
-            </w:r>
-            <w:r>
-              <w:rPr>
-                <w:i/>
-                <w:iCs/>
-                <w:color w:val="595959"/>
-                <w:sz w:val="18"/>
-                <w:szCs w:val="18"/>
-              </w:rPr>
-              <w:t>.</w:t>
-            </w:r>
-          </w:p>
-        </w:tc>
-        <w:tc>
-          <w:tcPr>
-            <w:tcW w:w="3199" w:type="dxa"/>
-            <w:tcBorders>
-              <w:top w:val="single" w:sz="4" w:space="0" w:color="000000"/>
-              <w:left w:val="single" w:sz="4" w:space="0" w:color="000000"/>
-              <w:bottom w:val="single" w:sz="4" w:space="0" w:color="000000"/>
-              <w:right w:val="single" w:sz="4" w:space="0" w:color="000000"/>
-            </w:tcBorders>
-          </w:tcPr>
-          <w:p>
-            <w:pPr>
-              <w:spacing w:after="80"/>
-            </w:pPr>
-            <w:r>
-              <w:rPr>
-                <w:b/>
-                <w:bCs/>
-              </w:rPr>
-              <w:t>paraphrase-multilingual-MiniLM-L12-v2</w:t>
-            </w:r>
-            <w:r>
-              <w:rPr>
-                <w:b/>
-                <w:bCs/>
-              </w:rPr>
-              <w:t xml:space="preserve">: </w:t>
-            </w:r>
-            <w:r>
-              <w:t>because all-MiniLM-L6-v2 is primary for English only!</w:t>
-            </w:r>
-          </w:p>
-        </w:tc>
-        <w:tc>
-          <w:tcPr>
-            <w:tcW w:w="1561" w:type="dxa"/>
-            <w:tcBorders>
-              <w:top w:val="single" w:sz="4" w:space="0" w:color="000000"/>
-              <w:left w:val="single" w:sz="4" w:space="0" w:color="000000"/>
-              <w:bottom w:val="single" w:sz="4" w:space="0" w:color="000000"/>
-              <w:right w:val="single" w:sz="4" w:space="0" w:color="000000"/>
-            </w:tcBorders>
-          </w:tcPr>
-          <w:p>
-            <w:pPr>
-              <w:spacing w:after="80"/>
-            </w:pPr>
-            <w:r>
-              <w:t>No</w:t>
-            </w:r>
-          </w:p>
-        </w:tc>
-      </w:tr>
-      <w:tr>
-        <w:tc>
-          <w:tcPr>
-            <w:tcW w:w="1699" w:type="dxa"/>
-            <w:tcBorders>
-              <w:top w:val="single" w:sz="4" w:space="0" w:color="000000"/>
-              <w:left w:val="single" w:sz="4" w:space="0" w:color="000000"/>
-              <w:bottom w:val="single" w:sz="4" w:space="0" w:color="000000"/>
-              <w:right w:val="single" w:sz="4" w:space="0" w:color="000000"/>
-            </w:tcBorders>
-          </w:tcPr>
-          <w:p>
-            <w:pPr>
-              <w:spacing w:after="80"/>
-            </w:pPr>
-            <w:r>
-              <w:t>Vector index</w:t>
-            </w:r>
-          </w:p>
-        </w:tc>
-        <w:tc>
-          <w:tcPr>
-            <w:tcW w:w="2901" w:type="dxa"/>
-            <w:tcBorders>
-              <w:top w:val="single" w:sz="4" w:space="0" w:color="000000"/>
-              <w:left w:val="single" w:sz="4" w:space="0" w:color="000000"/>
-              <w:bottom w:val="single" w:sz="4" w:space="0" w:color="000000"/>
-              <w:right w:val="single" w:sz="4" w:space="0" w:color="000000"/>
-            </w:tcBorders>
-          </w:tcPr>
-          <w:p>
-            <w:pPr>
-              <w:spacing w:after="80"/>
-            </w:pPr>
-            <w:r>
-              <w:rPr>
-                <w:i/>
-                <w:iCs/>
-                <w:color w:val="595959"/>
-                <w:sz w:val="18"/>
-                <w:szCs w:val="18"/>
-              </w:rPr>
-              <w:t>FAISS Flat L2 vs. FAISS HNSW.</w:t>
-            </w:r>
-          </w:p>
-        </w:tc>
-        <w:tc>
-          <w:tcPr>
-            <w:tcW w:w="3199" w:type="dxa"/>
-            <w:tcBorders>
-              <w:top w:val="single" w:sz="4" w:space="0" w:color="000000"/>
-              <w:left w:val="single" w:sz="4" w:space="0" w:color="000000"/>
-              <w:bottom w:val="single" w:sz="4" w:space="0" w:color="000000"/>
-              <w:right w:val="single" w:sz="4" w:space="0" w:color="000000"/>
-            </w:tcBorders>
-          </w:tcPr>
-          <w:p>
-            <w:pPr>
-              <w:spacing w:after="80"/>
-            </w:pPr>
-            <w:r>
-              <w:rPr>
-                <w:b/>
-                <w:bCs/>
-              </w:rPr>
-              <w:t xml:space="preserve">FAISS HNSW / </w:t>
-            </w:r>
-            <w:proofErr w:type="spellStart"/>
-            <w:r>
-              <w:rPr>
-                <w:b/>
-                <w:bCs/>
-              </w:rPr>
-              <w:t>FlatIP</w:t>
-            </w:r>
-            <w:proofErr w:type="spellEnd"/>
-            <w:r>
-              <w:rPr>
-                <w:b/>
-                <w:bCs/>
-              </w:rPr>
-              <w:t>:</w:t>
+              <w:t>FAISS HNSW / FlatIP:</w:t>
             </w:r>
             <w:r>
               <w:t xml:space="preserve"> HNSW provides rapid approximate nearest neighbor search for production, combined with Inner Product (IP) since embeddings are normalized.</w:t>
@@ -2460,25 +2162,409 @@
                 <w:color w:val="000000"/>
                 <w:sz w:val="20"/>
               </w:rPr>
-              <w:t xml:space="preserve">YOLOv8 Nano checkpoint downloaded via </w:t>
-            </w:r>
-            <w:proofErr w:type="spellStart"/>
+              <w:t>YOLOv8 Nano checkpoint downloaded via HuggingFace Hub:</w:t>
+            </w:r>
+            <w:r>
+              <w:rPr>
+                <w:rFonts w:ascii="system-ui;Ubuntu;Droid Sans;san" w:hAnsi="system-ui;Ubuntu;Droid Sans;san"/>
+                <w:color w:val="CCCCCC"/>
+                <w:sz w:val="20"/>
+              </w:rPr>
+              <w:t> </w:t>
+            </w:r>
+            <w:r>
+              <w:rPr>
+                <w:rStyle w:val="SourceText"/>
+              </w:rPr>
+              <w:t>hantian/yolo-doclaynet</w:t>
+            </w:r>
+          </w:p>
+        </w:tc>
+        <w:tc>
+          <w:tcPr>
+            <w:tcW w:w="2400" w:type="dxa"/>
+            <w:tcBorders>
+              <w:top w:val="single" w:sz="4" w:space="0" w:color="000000"/>
+              <w:left w:val="single" w:sz="4" w:space="0" w:color="000000"/>
+              <w:bottom w:val="single" w:sz="4" w:space="0" w:color="000000"/>
+              <w:right w:val="single" w:sz="4" w:space="0" w:color="000000"/>
+            </w:tcBorders>
+          </w:tcPr>
+          <w:p>
+            <w:pPr>
+              <w:spacing w:after="80"/>
+            </w:pPr>
             <w:r>
               <w:rPr>
                 <w:rFonts w:ascii="system-ui;Ubuntu;Droid Sans;san" w:hAnsi="system-ui;Ubuntu;Droid Sans;san"/>
                 <w:color w:val="000000"/>
                 <w:sz w:val="20"/>
               </w:rPr>
-              <w:t>HuggingFace</w:t>
-            </w:r>
-            <w:proofErr w:type="spellEnd"/>
+              <w:t>Ran with</w:t>
+            </w:r>
+            <w:r>
+              <w:rPr>
+                <w:rFonts w:ascii="system-ui;Ubuntu;Droid Sans;san" w:hAnsi="system-ui;Ubuntu;Droid Sans;san"/>
+                <w:color w:val="CCCCCC"/>
+                <w:sz w:val="20"/>
+              </w:rPr>
+              <w:t> </w:t>
+            </w:r>
+            <w:r>
+              <w:rPr>
+                <w:rStyle w:val="SourceText"/>
+              </w:rPr>
+              <w:t>verbose=False</w:t>
+            </w:r>
+            <w:r>
+              <w:rPr>
+                <w:rFonts w:ascii="system-ui;Ubuntu;Droid Sans;san" w:hAnsi="system-ui;Ubuntu;Droid Sans;san"/>
+                <w:color w:val="CCCCCC"/>
+                <w:sz w:val="20"/>
+              </w:rPr>
+              <w:t>.</w:t>
+            </w:r>
+          </w:p>
+        </w:tc>
+        <w:tc>
+          <w:tcPr>
+            <w:tcW w:w="2360" w:type="dxa"/>
+            <w:tcBorders>
+              <w:top w:val="single" w:sz="4" w:space="0" w:color="000000"/>
+              <w:left w:val="single" w:sz="4" w:space="0" w:color="000000"/>
+              <w:bottom w:val="single" w:sz="4" w:space="0" w:color="000000"/>
+              <w:right w:val="single" w:sz="4" w:space="0" w:color="000000"/>
+            </w:tcBorders>
+          </w:tcPr>
+          <w:p>
+            <w:pPr>
+              <w:spacing w:after="80"/>
+            </w:pPr>
+            <w:r>
+              <w:rPr>
+                <w:rStyle w:val="Strong"/>
+              </w:rPr>
+              <w:t>Fine-tuned</w:t>
+            </w:r>
+            <w:r>
+              <w:rPr>
+                <w:rFonts w:ascii="system-ui;Ubuntu;Droid Sans;san" w:hAnsi="system-ui;Ubuntu;Droid Sans;san"/>
+                <w:color w:val="CCCCCC"/>
+                <w:sz w:val="20"/>
+              </w:rPr>
+              <w:t xml:space="preserve">. </w:t>
+            </w:r>
             <w:r>
               <w:rPr>
                 <w:rFonts w:ascii="system-ui;Ubuntu;Droid Sans;san" w:hAnsi="system-ui;Ubuntu;Droid Sans;san"/>
                 <w:color w:val="000000"/>
                 <w:sz w:val="20"/>
               </w:rPr>
-              <w:t xml:space="preserve"> Hub:</w:t>
+              <w:t>The base YOLO structure is fine-tuned specifically on the DocLayNet dataset.</w:t>
+            </w:r>
+          </w:p>
+        </w:tc>
+      </w:tr>
+      <w:tr>
+        <w:tc>
+          <w:tcPr>
+            <w:tcW w:w="1900" w:type="dxa"/>
+            <w:tcBorders>
+              <w:top w:val="single" w:sz="4" w:space="0" w:color="000000"/>
+              <w:left w:val="single" w:sz="4" w:space="0" w:color="000000"/>
+              <w:bottom w:val="single" w:sz="4" w:space="0" w:color="000000"/>
+              <w:right w:val="single" w:sz="4" w:space="0" w:color="000000"/>
+            </w:tcBorders>
+          </w:tcPr>
+          <w:p>
+            <w:pPr>
+              <w:spacing w:after="80"/>
+            </w:pPr>
+            <w:r>
+              <w:t>OCR / HTR</w:t>
+            </w:r>
+          </w:p>
+        </w:tc>
+        <w:tc>
+          <w:tcPr>
+            <w:tcW w:w="2700" w:type="dxa"/>
+            <w:gridSpan w:val="2"/>
+            <w:tcBorders>
+              <w:top w:val="single" w:sz="4" w:space="0" w:color="000000"/>
+              <w:left w:val="single" w:sz="4" w:space="0" w:color="000000"/>
+              <w:bottom w:val="single" w:sz="4" w:space="0" w:color="000000"/>
+              <w:right w:val="single" w:sz="4" w:space="0" w:color="000000"/>
+            </w:tcBorders>
+          </w:tcPr>
+          <w:p>
+            <w:pPr>
+              <w:spacing w:after="80"/>
+            </w:pPr>
+            <w:r>
+              <w:t>Tesseract with custom ben_seerah.traineddata model</w:t>
+            </w:r>
+          </w:p>
+        </w:tc>
+        <w:tc>
+          <w:tcPr>
+            <w:tcW w:w="2400" w:type="dxa"/>
+            <w:tcBorders>
+              <w:top w:val="single" w:sz="4" w:space="0" w:color="000000"/>
+              <w:left w:val="single" w:sz="4" w:space="0" w:color="000000"/>
+              <w:bottom w:val="single" w:sz="4" w:space="0" w:color="000000"/>
+              <w:right w:val="single" w:sz="4" w:space="0" w:color="000000"/>
+            </w:tcBorders>
+          </w:tcPr>
+          <w:p>
+            <w:pPr>
+              <w:spacing w:after="80"/>
+            </w:pPr>
+            <w:r>
+              <w:t>psm=6 (Assume a single uniform block of text)</w:t>
+            </w:r>
+          </w:p>
+        </w:tc>
+        <w:tc>
+          <w:tcPr>
+            <w:tcW w:w="2360" w:type="dxa"/>
+            <w:tcBorders>
+              <w:top w:val="single" w:sz="4" w:space="0" w:color="000000"/>
+              <w:left w:val="single" w:sz="4" w:space="0" w:color="000000"/>
+              <w:bottom w:val="single" w:sz="4" w:space="0" w:color="000000"/>
+              <w:right w:val="single" w:sz="4" w:space="0" w:color="000000"/>
+            </w:tcBorders>
+          </w:tcPr>
+          <w:p>
+            <w:pPr>
+              <w:spacing w:after="80"/>
+            </w:pPr>
+            <w:r>
+              <w:t>Fine tuned</w:t>
+            </w:r>
+          </w:p>
+        </w:tc>
+      </w:tr>
+      <w:tr>
+        <w:tc>
+          <w:tcPr>
+            <w:tcW w:w="1900" w:type="dxa"/>
+            <w:tcBorders>
+              <w:top w:val="single" w:sz="4" w:space="0" w:color="000000"/>
+              <w:left w:val="single" w:sz="4" w:space="0" w:color="000000"/>
+              <w:bottom w:val="single" w:sz="4" w:space="0" w:color="000000"/>
+              <w:right w:val="single" w:sz="4" w:space="0" w:color="000000"/>
+            </w:tcBorders>
+          </w:tcPr>
+          <w:p>
+            <w:pPr>
+              <w:spacing w:after="80"/>
+            </w:pPr>
+            <w:r>
+              <w:t>Chunk</w:t>
+            </w:r>
+          </w:p>
+        </w:tc>
+        <w:tc>
+          <w:tcPr>
+            <w:tcW w:w="2700" w:type="dxa"/>
+            <w:gridSpan w:val="2"/>
+            <w:tcBorders>
+              <w:top w:val="single" w:sz="4" w:space="0" w:color="000000"/>
+              <w:left w:val="single" w:sz="4" w:space="0" w:color="000000"/>
+              <w:bottom w:val="single" w:sz="4" w:space="0" w:color="000000"/>
+              <w:right w:val="single" w:sz="4" w:space="0" w:color="000000"/>
+            </w:tcBorders>
+          </w:tcPr>
+          <w:p>
+            <w:pPr>
+              <w:spacing w:after="80"/>
+              <w:rPr>
+                <w:rFonts w:ascii="system-ui;Ubuntu;Droid Sans;san" w:hAnsi="system-ui;Ubuntu;Droid Sans;san"/>
+                <w:color w:val="000000"/>
+                <w:sz w:val="20"/>
+              </w:rPr>
+            </w:pPr>
+            <w:r>
+              <w:rPr>
+                <w:rFonts w:ascii="system-ui;Ubuntu;Droid Sans;san" w:hAnsi="system-ui;Ubuntu;Droid Sans;san"/>
+                <w:color w:val="000000"/>
+                <w:sz w:val="20"/>
+              </w:rPr>
+              <w:t>Rule-based algorithm (No ML).</w:t>
+            </w:r>
+          </w:p>
+        </w:tc>
+        <w:tc>
+          <w:tcPr>
+            <w:tcW w:w="2400" w:type="dxa"/>
+            <w:tcBorders>
+              <w:top w:val="single" w:sz="4" w:space="0" w:color="000000"/>
+              <w:left w:val="single" w:sz="4" w:space="0" w:color="000000"/>
+              <w:bottom w:val="single" w:sz="4" w:space="0" w:color="000000"/>
+              <w:right w:val="single" w:sz="4" w:space="0" w:color="000000"/>
+            </w:tcBorders>
+          </w:tcPr>
+          <w:p>
+            <w:pPr>
+              <w:spacing w:after="80"/>
+            </w:pPr>
+            <w:r>
+              <w:rPr>
+                <w:rStyle w:val="SourceText"/>
+              </w:rPr>
+              <w:t>chunk_size</w:t>
+            </w:r>
+            <w:r>
+              <w:rPr>
+                <w:color w:val="000000"/>
+              </w:rPr>
+              <w:t> </w:t>
+            </w:r>
+            <w:r>
+              <w:rPr>
+                <w:rFonts w:ascii="system-ui;Ubuntu;Droid Sans;san" w:hAnsi="system-ui;Ubuntu;Droid Sans;san"/>
+                <w:color w:val="000000"/>
+                <w:sz w:val="20"/>
+              </w:rPr>
+              <w:t>defaults to 500, </w:t>
+            </w:r>
+            <w:r>
+              <w:rPr>
+                <w:rStyle w:val="SourceText"/>
+                <w:color w:val="000000"/>
+              </w:rPr>
+              <w:t>chunk_overlap</w:t>
+            </w:r>
+            <w:r>
+              <w:rPr>
+                <w:color w:val="000000"/>
+              </w:rPr>
+              <w:t> </w:t>
+            </w:r>
+            <w:r>
+              <w:rPr>
+                <w:rFonts w:ascii="system-ui;Ubuntu;Droid Sans;san" w:hAnsi="system-ui;Ubuntu;Droid Sans;san"/>
+                <w:color w:val="000000"/>
+                <w:sz w:val="20"/>
+              </w:rPr>
+              <w:t>defaults to 50. Uses recursive fallback delimiters: </w:t>
+            </w:r>
+            <w:r>
+              <w:rPr>
+                <w:rStyle w:val="SourceText"/>
+                <w:color w:val="000000"/>
+              </w:rPr>
+              <w:t>["\n\n", "\n", " ", ""]</w:t>
+            </w:r>
+            <w:r>
+              <w:rPr>
+                <w:rFonts w:ascii="system-ui;Ubuntu;Droid Sans;san" w:hAnsi="system-ui;Ubuntu;Droid Sans;san"/>
+                <w:color w:val="000000"/>
+                <w:sz w:val="20"/>
+              </w:rPr>
+              <w:t>.</w:t>
+            </w:r>
+          </w:p>
+        </w:tc>
+        <w:tc>
+          <w:tcPr>
+            <w:tcW w:w="2360" w:type="dxa"/>
+            <w:tcBorders>
+              <w:top w:val="single" w:sz="4" w:space="0" w:color="000000"/>
+              <w:left w:val="single" w:sz="4" w:space="0" w:color="000000"/>
+              <w:bottom w:val="single" w:sz="4" w:space="0" w:color="000000"/>
+              <w:right w:val="single" w:sz="4" w:space="0" w:color="000000"/>
+            </w:tcBorders>
+          </w:tcPr>
+          <w:p>
+            <w:pPr>
+              <w:spacing w:after="80"/>
+            </w:pPr>
+            <w:r>
+              <w:t>-</w:t>
+            </w:r>
+          </w:p>
+        </w:tc>
+      </w:tr>
+      <w:tr>
+        <w:tc>
+          <w:tcPr>
+            <w:tcW w:w="1900" w:type="dxa"/>
+            <w:tcBorders>
+              <w:top w:val="single" w:sz="4" w:space="0" w:color="000000"/>
+              <w:left w:val="single" w:sz="4" w:space="0" w:color="000000"/>
+              <w:bottom w:val="single" w:sz="4" w:space="0" w:color="000000"/>
+              <w:right w:val="single" w:sz="4" w:space="0" w:color="000000"/>
+            </w:tcBorders>
+          </w:tcPr>
+          <w:p>
+            <w:pPr>
+              <w:spacing w:after="80"/>
+            </w:pPr>
+            <w:r>
+              <w:t>Embed</w:t>
+            </w:r>
+          </w:p>
+        </w:tc>
+        <w:tc>
+          <w:tcPr>
+            <w:tcW w:w="2700" w:type="dxa"/>
+            <w:gridSpan w:val="2"/>
+            <w:tcBorders>
+              <w:top w:val="single" w:sz="4" w:space="0" w:color="000000"/>
+              <w:left w:val="single" w:sz="4" w:space="0" w:color="000000"/>
+              <w:bottom w:val="single" w:sz="4" w:space="0" w:color="000000"/>
+              <w:right w:val="single" w:sz="4" w:space="0" w:color="000000"/>
+            </w:tcBorders>
+          </w:tcPr>
+          <w:p>
+            <w:pPr>
+              <w:spacing w:after="80"/>
+            </w:pPr>
+            <w:r>
+              <w:rPr>
+                <w:rFonts w:ascii="system-ui;Ubuntu;Droid Sans;san" w:hAnsi="system-ui;Ubuntu;Droid Sans;san"/>
+                <w:color w:val="000000"/>
+                <w:sz w:val="20"/>
+              </w:rPr>
+              <w:t>SentenceTransformer, checkpoint: </w:t>
+            </w:r>
+            <w:r>
+              <w:rPr>
+                <w:b/>
+                <w:bCs/>
+              </w:rPr>
+              <w:t>paraphrase-multilingual-MiniLM-L12-v2</w:t>
+            </w:r>
+            <w:r>
+              <w:rPr>
+                <w:rFonts w:ascii="system-ui;Ubuntu;Droid Sans;san" w:hAnsi="system-ui;Ubuntu;Droid Sans;san"/>
+                <w:color w:val="000000"/>
+                <w:sz w:val="20"/>
+              </w:rPr>
+              <w:t>. (Also features a graceful fallback to a 384-dimensional TF-IDF vectorizer if neural frameworks fail).</w:t>
+            </w:r>
+          </w:p>
+        </w:tc>
+        <w:tc>
+          <w:tcPr>
+            <w:tcW w:w="2400" w:type="dxa"/>
+            <w:tcBorders>
+              <w:top w:val="single" w:sz="4" w:space="0" w:color="000000"/>
+              <w:left w:val="single" w:sz="4" w:space="0" w:color="000000"/>
+              <w:bottom w:val="single" w:sz="4" w:space="0" w:color="000000"/>
+              <w:right w:val="single" w:sz="4" w:space="0" w:color="000000"/>
+            </w:tcBorders>
+          </w:tcPr>
+          <w:p>
+            <w:pPr>
+              <w:spacing w:after="80"/>
+            </w:pPr>
+            <w:r>
+              <w:rPr>
+                <w:rStyle w:val="SourceText"/>
+              </w:rPr>
+              <w:t>normalize_embeddings=True</w:t>
             </w:r>
             <w:r>
               <w:rPr>
@@ -2486,185 +2572,100 @@
                 <w:color w:val="CCCCCC"/>
                 <w:sz w:val="20"/>
               </w:rPr>
+              <w:t>, </w:t>
+            </w:r>
+            <w:r>
+              <w:rPr>
+                <w:rStyle w:val="SourceText"/>
+              </w:rPr>
+              <w:t>show_progress_bar=False</w:t>
+            </w:r>
+          </w:p>
+        </w:tc>
+        <w:tc>
+          <w:tcPr>
+            <w:tcW w:w="2360" w:type="dxa"/>
+            <w:tcBorders>
+              <w:top w:val="single" w:sz="4" w:space="0" w:color="000000"/>
+              <w:left w:val="single" w:sz="4" w:space="0" w:color="000000"/>
+              <w:bottom w:val="single" w:sz="4" w:space="0" w:color="000000"/>
+              <w:right w:val="single" w:sz="4" w:space="0" w:color="000000"/>
+            </w:tcBorders>
+          </w:tcPr>
+          <w:p>
+            <w:pPr>
+              <w:spacing w:after="80"/>
+            </w:pPr>
+            <w:r>
+              <w:rPr>
+                <w:color w:val="CCCCCC"/>
+              </w:rPr>
               <w:t> </w:t>
             </w:r>
-            <w:proofErr w:type="spellStart"/>
-            <w:r>
-              <w:rPr>
-                <w:rStyle w:val="SourceText"/>
-              </w:rPr>
-              <w:t>hantian</w:t>
-            </w:r>
-            <w:proofErr w:type="spellEnd"/>
-            <w:r>
-              <w:rPr>
-                <w:rStyle w:val="SourceText"/>
-              </w:rPr>
-              <w:t>/yolo-</w:t>
-            </w:r>
-            <w:proofErr w:type="spellStart"/>
-            <w:r>
-              <w:rPr>
-                <w:rStyle w:val="SourceText"/>
-              </w:rPr>
-              <w:t>doclaynet</w:t>
-            </w:r>
-            <w:proofErr w:type="spellEnd"/>
-          </w:p>
-        </w:tc>
-        <w:tc>
-          <w:tcPr>
-            <w:tcW w:w="2400" w:type="dxa"/>
-            <w:tcBorders>
-              <w:top w:val="single" w:sz="4" w:space="0" w:color="000000"/>
-              <w:left w:val="single" w:sz="4" w:space="0" w:color="000000"/>
-              <w:bottom w:val="single" w:sz="4" w:space="0" w:color="000000"/>
-              <w:right w:val="single" w:sz="4" w:space="0" w:color="000000"/>
-            </w:tcBorders>
-          </w:tcPr>
-          <w:p>
-            <w:pPr>
-              <w:spacing w:after="80"/>
-            </w:pPr>
-            <w:r>
+            <w:r>
+              <w:rPr>
+                <w:rStyle w:val="Strong"/>
+              </w:rPr>
+              <w:t>Pretrained</w:t>
+            </w:r>
+            <w:r>
+              <w:rPr>
+                <w:rFonts w:ascii="system-ui;Ubuntu;Droid Sans;san" w:hAnsi="system-ui;Ubuntu;Droid Sans;san"/>
+                <w:color w:val="CCCCCC"/>
+                <w:sz w:val="20"/>
+              </w:rPr>
+              <w:t>.</w:t>
+            </w:r>
+          </w:p>
+        </w:tc>
+      </w:tr>
+      <w:tr>
+        <w:tc>
+          <w:tcPr>
+            <w:tcW w:w="1900" w:type="dxa"/>
+            <w:tcBorders>
+              <w:top w:val="single" w:sz="4" w:space="0" w:color="000000"/>
+              <w:left w:val="single" w:sz="4" w:space="0" w:color="000000"/>
+              <w:bottom w:val="single" w:sz="4" w:space="0" w:color="000000"/>
+              <w:right w:val="single" w:sz="4" w:space="0" w:color="000000"/>
+            </w:tcBorders>
+          </w:tcPr>
+          <w:p>
+            <w:pPr>
+              <w:spacing w:after="80"/>
+            </w:pPr>
+            <w:r>
+              <w:t>Index</w:t>
+            </w:r>
+          </w:p>
+        </w:tc>
+        <w:tc>
+          <w:tcPr>
+            <w:tcW w:w="2700" w:type="dxa"/>
+            <w:gridSpan w:val="2"/>
+            <w:tcBorders>
+              <w:top w:val="single" w:sz="4" w:space="0" w:color="000000"/>
+              <w:left w:val="single" w:sz="4" w:space="0" w:color="000000"/>
+              <w:bottom w:val="single" w:sz="4" w:space="0" w:color="000000"/>
+              <w:right w:val="single" w:sz="4" w:space="0" w:color="000000"/>
+            </w:tcBorders>
+          </w:tcPr>
+          <w:p>
+            <w:pPr>
+              <w:spacing w:after="80"/>
               <w:rPr>
                 <w:rFonts w:ascii="system-ui;Ubuntu;Droid Sans;san" w:hAnsi="system-ui;Ubuntu;Droid Sans;san"/>
                 <w:color w:val="000000"/>
                 <w:sz w:val="20"/>
               </w:rPr>
-              <w:t>Ran with</w:t>
-            </w:r>
-            <w:r>
-              <w:rPr>
-                <w:rFonts w:ascii="system-ui;Ubuntu;Droid Sans;san" w:hAnsi="system-ui;Ubuntu;Droid Sans;san"/>
-                <w:color w:val="CCCCCC"/>
-                <w:sz w:val="20"/>
-              </w:rPr>
-              <w:t> </w:t>
-            </w:r>
-            <w:r>
-              <w:rPr>
-                <w:rStyle w:val="SourceText"/>
-              </w:rPr>
-              <w:t>verbose=False</w:t>
-            </w:r>
-            <w:r>
-              <w:rPr>
-                <w:rFonts w:ascii="system-ui;Ubuntu;Droid Sans;san" w:hAnsi="system-ui;Ubuntu;Droid Sans;san"/>
-                <w:color w:val="CCCCCC"/>
-                <w:sz w:val="20"/>
-              </w:rPr>
-              <w:t>.</w:t>
-            </w:r>
-          </w:p>
-        </w:tc>
-        <w:tc>
-          <w:tcPr>
-            <w:tcW w:w="2360" w:type="dxa"/>
-            <w:tcBorders>
-              <w:top w:val="single" w:sz="4" w:space="0" w:color="000000"/>
-              <w:left w:val="single" w:sz="4" w:space="0" w:color="000000"/>
-              <w:bottom w:val="single" w:sz="4" w:space="0" w:color="000000"/>
-              <w:right w:val="single" w:sz="4" w:space="0" w:color="000000"/>
-            </w:tcBorders>
-          </w:tcPr>
-          <w:p>
-            <w:pPr>
-              <w:spacing w:after="80"/>
-            </w:pPr>
-            <w:r>
-              <w:rPr>
-                <w:rStyle w:val="Strong"/>
-              </w:rPr>
-              <w:t>Fine-tuned</w:t>
-            </w:r>
-            <w:r>
-              <w:rPr>
-                <w:rFonts w:ascii="system-ui;Ubuntu;Droid Sans;san" w:hAnsi="system-ui;Ubuntu;Droid Sans;san"/>
-                <w:color w:val="CCCCCC"/>
-                <w:sz w:val="20"/>
-              </w:rPr>
-              <w:t xml:space="preserve">. </w:t>
-            </w:r>
+            </w:pPr>
             <w:r>
               <w:rPr>
                 <w:rFonts w:ascii="system-ui;Ubuntu;Droid Sans;san" w:hAnsi="system-ui;Ubuntu;Droid Sans;san"/>
                 <w:color w:val="000000"/>
                 <w:sz w:val="20"/>
               </w:rPr>
-              <w:t xml:space="preserve">The base YOLO structure is fine-tuned specifically on the </w:t>
-            </w:r>
-            <w:proofErr w:type="spellStart"/>
-            <w:r>
-              <w:rPr>
-                <w:rFonts w:ascii="system-ui;Ubuntu;Droid Sans;san" w:hAnsi="system-ui;Ubuntu;Droid Sans;san"/>
-                <w:color w:val="000000"/>
-                <w:sz w:val="20"/>
-              </w:rPr>
-              <w:t>DocLayNet</w:t>
-            </w:r>
-            <w:proofErr w:type="spellEnd"/>
-            <w:r>
-              <w:rPr>
-                <w:rFonts w:ascii="system-ui;Ubuntu;Droid Sans;san" w:hAnsi="system-ui;Ubuntu;Droid Sans;san"/>
-                <w:color w:val="000000"/>
-                <w:sz w:val="20"/>
-              </w:rPr>
-              <w:t xml:space="preserve"> dataset.</w:t>
-            </w:r>
-          </w:p>
-        </w:tc>
-      </w:tr>
-      <w:tr>
-        <w:tc>
-          <w:tcPr>
-            <w:tcW w:w="1900" w:type="dxa"/>
-            <w:tcBorders>
-              <w:top w:val="single" w:sz="4" w:space="0" w:color="000000"/>
-              <w:left w:val="single" w:sz="4" w:space="0" w:color="000000"/>
-              <w:bottom w:val="single" w:sz="4" w:space="0" w:color="000000"/>
-              <w:right w:val="single" w:sz="4" w:space="0" w:color="000000"/>
-            </w:tcBorders>
-          </w:tcPr>
-          <w:p>
-            <w:pPr>
-              <w:spacing w:after="80"/>
-            </w:pPr>
-            <w:r>
-              <w:t>OCR / HTR</w:t>
-            </w:r>
-          </w:p>
-        </w:tc>
-        <w:tc>
-          <w:tcPr>
-            <w:tcW w:w="2700" w:type="dxa"/>
-            <w:gridSpan w:val="2"/>
-            <w:tcBorders>
-              <w:top w:val="single" w:sz="4" w:space="0" w:color="000000"/>
-              <w:left w:val="single" w:sz="4" w:space="0" w:color="000000"/>
-              <w:bottom w:val="single" w:sz="4" w:space="0" w:color="000000"/>
-              <w:right w:val="single" w:sz="4" w:space="0" w:color="000000"/>
-            </w:tcBorders>
-          </w:tcPr>
-          <w:p>
-            <w:pPr>
-              <w:spacing w:after="80"/>
-            </w:pPr>
-            <w:r>
-              <w:t xml:space="preserve">Tesseract with custom </w:t>
-            </w:r>
-            <w:proofErr w:type="spellStart"/>
-            <w:r>
-              <w:t>ben_</w:t>
-            </w:r>
-            <w:proofErr w:type="gramStart"/>
-            <w:r>
-              <w:t>seerah.traineddata</w:t>
-            </w:r>
-            <w:proofErr w:type="spellEnd"/>
-            <w:proofErr w:type="gramEnd"/>
-            <w:r>
-              <w:t xml:space="preserve"> model</w:t>
+              <w:t>Faiss Vector Index (Algorithmic space, no ML model).</w:t>
             </w:r>
           </w:p>
         </w:tc>
@@ -2682,445 +2683,11 @@
             <w:pPr>
               <w:spacing w:after="80"/>
             </w:pPr>
-            <w:proofErr w:type="spellStart"/>
-            <w:r>
-              <w:t>psm</w:t>
-            </w:r>
-            <w:proofErr w:type="spellEnd"/>
-            <w:r>
-              <w:t>=6 (Assume a single uniform block of text)</w:t>
-            </w:r>
-          </w:p>
-        </w:tc>
-        <w:tc>
-          <w:tcPr>
-            <w:tcW w:w="2360" w:type="dxa"/>
-            <w:tcBorders>
-              <w:top w:val="single" w:sz="4" w:space="0" w:color="000000"/>
-              <w:left w:val="single" w:sz="4" w:space="0" w:color="000000"/>
-              <w:bottom w:val="single" w:sz="4" w:space="0" w:color="000000"/>
-              <w:right w:val="single" w:sz="4" w:space="0" w:color="000000"/>
-            </w:tcBorders>
-          </w:tcPr>
-          <w:p>
-            <w:pPr>
-              <w:spacing w:after="80"/>
-            </w:pPr>
-            <w:r>
-              <w:t>Fine tuned</w:t>
-            </w:r>
-          </w:p>
-        </w:tc>
-      </w:tr>
-      <w:tr>
-        <w:tc>
-          <w:tcPr>
-            <w:tcW w:w="1900" w:type="dxa"/>
-            <w:tcBorders>
-              <w:top w:val="single" w:sz="4" w:space="0" w:color="000000"/>
-              <w:left w:val="single" w:sz="4" w:space="0" w:color="000000"/>
-              <w:bottom w:val="single" w:sz="4" w:space="0" w:color="000000"/>
-              <w:right w:val="single" w:sz="4" w:space="0" w:color="000000"/>
-            </w:tcBorders>
-          </w:tcPr>
-          <w:p>
-            <w:pPr>
-              <w:spacing w:after="80"/>
-            </w:pPr>
-            <w:r>
-              <w:t>Chunk</w:t>
-            </w:r>
-          </w:p>
-        </w:tc>
-        <w:tc>
-          <w:tcPr>
-            <w:tcW w:w="2700" w:type="dxa"/>
-            <w:gridSpan w:val="2"/>
-            <w:tcBorders>
-              <w:top w:val="single" w:sz="4" w:space="0" w:color="000000"/>
-              <w:left w:val="single" w:sz="4" w:space="0" w:color="000000"/>
-              <w:bottom w:val="single" w:sz="4" w:space="0" w:color="000000"/>
-              <w:right w:val="single" w:sz="4" w:space="0" w:color="000000"/>
-            </w:tcBorders>
-          </w:tcPr>
-          <w:p>
-            <w:pPr>
-              <w:spacing w:after="80"/>
-              <w:rPr>
-                <w:rFonts w:ascii="system-ui;Ubuntu;Droid Sans;san" w:hAnsi="system-ui;Ubuntu;Droid Sans;san"/>
-                <w:color w:val="000000"/>
-                <w:sz w:val="20"/>
-              </w:rPr>
-            </w:pPr>
-            <w:r>
-              <w:rPr>
-                <w:rFonts w:ascii="system-ui;Ubuntu;Droid Sans;san" w:hAnsi="system-ui;Ubuntu;Droid Sans;san"/>
-                <w:color w:val="000000"/>
-                <w:sz w:val="20"/>
-              </w:rPr>
-              <w:t>Rule-based algorithm (No ML).</w:t>
-            </w:r>
-          </w:p>
-        </w:tc>
-        <w:tc>
-          <w:tcPr>
-            <w:tcW w:w="2400" w:type="dxa"/>
-            <w:tcBorders>
-              <w:top w:val="single" w:sz="4" w:space="0" w:color="000000"/>
-              <w:left w:val="single" w:sz="4" w:space="0" w:color="000000"/>
-              <w:bottom w:val="single" w:sz="4" w:space="0" w:color="000000"/>
-              <w:right w:val="single" w:sz="4" w:space="0" w:color="000000"/>
-            </w:tcBorders>
-          </w:tcPr>
-          <w:p>
-            <w:pPr>
-              <w:spacing w:after="80"/>
-            </w:pPr>
-            <w:proofErr w:type="spellStart"/>
-            <w:r>
-              <w:rPr>
-                <w:rStyle w:val="SourceText"/>
-              </w:rPr>
-              <w:t>chunk_size</w:t>
-            </w:r>
-            <w:proofErr w:type="spellEnd"/>
-            <w:r>
-              <w:rPr>
-                <w:color w:val="000000"/>
-              </w:rPr>
-              <w:t> </w:t>
-            </w:r>
-            <w:r>
-              <w:rPr>
-                <w:rFonts w:ascii="system-ui;Ubuntu;Droid Sans;san" w:hAnsi="system-ui;Ubuntu;Droid Sans;san"/>
-                <w:color w:val="000000"/>
-                <w:sz w:val="20"/>
-              </w:rPr>
-              <w:t>defaults to 500, </w:t>
-            </w:r>
-            <w:proofErr w:type="spellStart"/>
-            <w:r>
-              <w:rPr>
-                <w:rStyle w:val="SourceText"/>
-                <w:color w:val="000000"/>
-              </w:rPr>
-              <w:t>chunk_overlap</w:t>
-            </w:r>
-            <w:proofErr w:type="spellEnd"/>
-            <w:r>
-              <w:rPr>
-                <w:color w:val="000000"/>
-              </w:rPr>
-              <w:t> </w:t>
-            </w:r>
-            <w:r>
-              <w:rPr>
-                <w:rFonts w:ascii="system-ui;Ubuntu;Droid Sans;san" w:hAnsi="system-ui;Ubuntu;Droid Sans;san"/>
-                <w:color w:val="000000"/>
-                <w:sz w:val="20"/>
-              </w:rPr>
-              <w:t>defaults to 50. Uses recursive fallback delimiters: </w:t>
-            </w:r>
-            <w:r>
-              <w:rPr>
-                <w:rStyle w:val="SourceText"/>
-                <w:color w:val="000000"/>
-              </w:rPr>
-              <w:t>["\n\n", "\n", " ", ""]</w:t>
-            </w:r>
-            <w:r>
-              <w:rPr>
-                <w:rFonts w:ascii="system-ui;Ubuntu;Droid Sans;san" w:hAnsi="system-ui;Ubuntu;Droid Sans;san"/>
-                <w:color w:val="000000"/>
-                <w:sz w:val="20"/>
-              </w:rPr>
-              <w:t>.</w:t>
-            </w:r>
-          </w:p>
-        </w:tc>
-        <w:tc>
-          <w:tcPr>
-            <w:tcW w:w="2360" w:type="dxa"/>
-            <w:tcBorders>
-              <w:top w:val="single" w:sz="4" w:space="0" w:color="000000"/>
-              <w:left w:val="single" w:sz="4" w:space="0" w:color="000000"/>
-              <w:bottom w:val="single" w:sz="4" w:space="0" w:color="000000"/>
-              <w:right w:val="single" w:sz="4" w:space="0" w:color="000000"/>
-            </w:tcBorders>
-          </w:tcPr>
-          <w:p>
-            <w:pPr>
-              <w:spacing w:after="80"/>
-            </w:pPr>
-            <w:r>
-              <w:t>-</w:t>
-            </w:r>
-          </w:p>
-        </w:tc>
-      </w:tr>
-      <w:tr>
-        <w:tc>
-          <w:tcPr>
-            <w:tcW w:w="1900" w:type="dxa"/>
-            <w:tcBorders>
-              <w:top w:val="single" w:sz="4" w:space="0" w:color="000000"/>
-              <w:left w:val="single" w:sz="4" w:space="0" w:color="000000"/>
-              <w:bottom w:val="single" w:sz="4" w:space="0" w:color="000000"/>
-              <w:right w:val="single" w:sz="4" w:space="0" w:color="000000"/>
-            </w:tcBorders>
-          </w:tcPr>
-          <w:p>
-            <w:pPr>
-              <w:spacing w:after="80"/>
-            </w:pPr>
-            <w:r>
-              <w:t>Embed</w:t>
-            </w:r>
-          </w:p>
-        </w:tc>
-        <w:tc>
-          <w:tcPr>
-            <w:tcW w:w="2700" w:type="dxa"/>
-            <w:gridSpan w:val="2"/>
-            <w:tcBorders>
-              <w:top w:val="single" w:sz="4" w:space="0" w:color="000000"/>
-              <w:left w:val="single" w:sz="4" w:space="0" w:color="000000"/>
-              <w:bottom w:val="single" w:sz="4" w:space="0" w:color="000000"/>
-              <w:right w:val="single" w:sz="4" w:space="0" w:color="000000"/>
-            </w:tcBorders>
-          </w:tcPr>
-          <w:p>
-            <w:pPr>
-              <w:spacing w:after="80"/>
-            </w:pPr>
-            <w:proofErr w:type="spellStart"/>
-            <w:r>
-              <w:rPr>
-                <w:rFonts w:ascii="system-ui;Ubuntu;Droid Sans;san" w:hAnsi="system-ui;Ubuntu;Droid Sans;san"/>
-                <w:color w:val="000000"/>
-                <w:sz w:val="20"/>
-              </w:rPr>
-              <w:t>SentenceTransformer</w:t>
-            </w:r>
-            <w:proofErr w:type="spellEnd"/>
-            <w:r>
-              <w:rPr>
-                <w:rFonts w:ascii="system-ui;Ubuntu;Droid Sans;san" w:hAnsi="system-ui;Ubuntu;Droid Sans;san"/>
-                <w:color w:val="000000"/>
-                <w:sz w:val="20"/>
-              </w:rPr>
-              <w:t>, checkpoint: </w:t>
-            </w:r>
-            <w:r>
-              <w:rPr>
-                <w:b/>
-                <w:bCs/>
-              </w:rPr>
-              <w:t>paraphrase-multilingual-MiniLM-L12-v2</w:t>
-            </w:r>
-            <w:r>
-              <w:rPr>
-                <w:rFonts w:ascii="system-ui;Ubuntu;Droid Sans;san" w:hAnsi="system-ui;Ubuntu;Droid Sans;san"/>
-                <w:color w:val="000000"/>
-                <w:sz w:val="20"/>
-              </w:rPr>
-              <w:t>. (Also features a graceful fallback to a 384-dimensional TF-IDF vectorizer if neural frameworks fail).</w:t>
-            </w:r>
-          </w:p>
-        </w:tc>
-        <w:tc>
-          <w:tcPr>
-            <w:tcW w:w="2400" w:type="dxa"/>
-            <w:tcBorders>
-              <w:top w:val="single" w:sz="4" w:space="0" w:color="000000"/>
-              <w:left w:val="single" w:sz="4" w:space="0" w:color="000000"/>
-              <w:bottom w:val="single" w:sz="4" w:space="0" w:color="000000"/>
-              <w:right w:val="single" w:sz="4" w:space="0" w:color="000000"/>
-            </w:tcBorders>
-          </w:tcPr>
-          <w:p>
-            <w:pPr>
-              <w:spacing w:after="80"/>
-            </w:pPr>
-            <w:proofErr w:type="spellStart"/>
-            <w:r>
-              <w:rPr>
-                <w:rStyle w:val="SourceText"/>
-              </w:rPr>
-              <w:t>normalize_embeddings</w:t>
-            </w:r>
-            <w:proofErr w:type="spellEnd"/>
-            <w:r>
-              <w:rPr>
-                <w:rStyle w:val="SourceText"/>
-              </w:rPr>
-              <w:t>=True</w:t>
-            </w:r>
-            <w:r>
-              <w:rPr>
-                <w:rFonts w:ascii="system-ui;Ubuntu;Droid Sans;san" w:hAnsi="system-ui;Ubuntu;Droid Sans;san"/>
-                <w:color w:val="CCCCCC"/>
-                <w:sz w:val="20"/>
-              </w:rPr>
-              <w:t>, </w:t>
-            </w:r>
-            <w:proofErr w:type="spellStart"/>
-            <w:r>
-              <w:rPr>
-                <w:rStyle w:val="SourceText"/>
-              </w:rPr>
-              <w:t>show_progress_bar</w:t>
-            </w:r>
-            <w:proofErr w:type="spellEnd"/>
-            <w:r>
-              <w:rPr>
-                <w:rStyle w:val="SourceText"/>
-              </w:rPr>
-              <w:t>=False</w:t>
-            </w:r>
-          </w:p>
-        </w:tc>
-        <w:tc>
-          <w:tcPr>
-            <w:tcW w:w="2360" w:type="dxa"/>
-            <w:tcBorders>
-              <w:top w:val="single" w:sz="4" w:space="0" w:color="000000"/>
-              <w:left w:val="single" w:sz="4" w:space="0" w:color="000000"/>
-              <w:bottom w:val="single" w:sz="4" w:space="0" w:color="000000"/>
-              <w:right w:val="single" w:sz="4" w:space="0" w:color="000000"/>
-            </w:tcBorders>
-          </w:tcPr>
-          <w:p>
-            <w:pPr>
-              <w:spacing w:after="80"/>
-            </w:pPr>
-            <w:r>
-              <w:rPr>
-                <w:color w:val="CCCCCC"/>
-              </w:rPr>
-              <w:t> </w:t>
-            </w:r>
-            <w:r>
-              <w:rPr>
-                <w:rStyle w:val="Strong"/>
-              </w:rPr>
-              <w:t>Pretrained</w:t>
-            </w:r>
-            <w:r>
-              <w:rPr>
-                <w:rFonts w:ascii="system-ui;Ubuntu;Droid Sans;san" w:hAnsi="system-ui;Ubuntu;Droid Sans;san"/>
-                <w:color w:val="CCCCCC"/>
-                <w:sz w:val="20"/>
-              </w:rPr>
-              <w:t>.</w:t>
-            </w:r>
-          </w:p>
-        </w:tc>
-      </w:tr>
-      <w:tr>
-        <w:tc>
-          <w:tcPr>
-            <w:tcW w:w="1900" w:type="dxa"/>
-            <w:tcBorders>
-              <w:top w:val="single" w:sz="4" w:space="0" w:color="000000"/>
-              <w:left w:val="single" w:sz="4" w:space="0" w:color="000000"/>
-              <w:bottom w:val="single" w:sz="4" w:space="0" w:color="000000"/>
-              <w:right w:val="single" w:sz="4" w:space="0" w:color="000000"/>
-            </w:tcBorders>
-          </w:tcPr>
-          <w:p>
-            <w:pPr>
-              <w:spacing w:after="80"/>
-            </w:pPr>
-            <w:r>
-              <w:t>Index</w:t>
-            </w:r>
-          </w:p>
-        </w:tc>
-        <w:tc>
-          <w:tcPr>
-            <w:tcW w:w="2700" w:type="dxa"/>
-            <w:gridSpan w:val="2"/>
-            <w:tcBorders>
-              <w:top w:val="single" w:sz="4" w:space="0" w:color="000000"/>
-              <w:left w:val="single" w:sz="4" w:space="0" w:color="000000"/>
-              <w:bottom w:val="single" w:sz="4" w:space="0" w:color="000000"/>
-              <w:right w:val="single" w:sz="4" w:space="0" w:color="000000"/>
-            </w:tcBorders>
-          </w:tcPr>
-          <w:p>
-            <w:pPr>
-              <w:spacing w:after="80"/>
-              <w:rPr>
-                <w:rFonts w:ascii="system-ui;Ubuntu;Droid Sans;san" w:hAnsi="system-ui;Ubuntu;Droid Sans;san"/>
-                <w:color w:val="000000"/>
-                <w:sz w:val="20"/>
-              </w:rPr>
-            </w:pPr>
-            <w:proofErr w:type="spellStart"/>
-            <w:r>
-              <w:rPr>
-                <w:rFonts w:ascii="system-ui;Ubuntu;Droid Sans;san" w:hAnsi="system-ui;Ubuntu;Droid Sans;san"/>
-                <w:color w:val="000000"/>
-                <w:sz w:val="20"/>
-              </w:rPr>
-              <w:t>Faiss</w:t>
-            </w:r>
-            <w:proofErr w:type="spellEnd"/>
-            <w:r>
-              <w:rPr>
-                <w:rFonts w:ascii="system-ui;Ubuntu;Droid Sans;san" w:hAnsi="system-ui;Ubuntu;Droid Sans;san"/>
-                <w:color w:val="000000"/>
-                <w:sz w:val="20"/>
-              </w:rPr>
-              <w:t xml:space="preserve"> Vector Index (Algorithmic space, no ML model).</w:t>
-            </w:r>
-          </w:p>
-        </w:tc>
-        <w:tc>
-          <w:tcPr>
-            <w:tcW w:w="2400" w:type="dxa"/>
-            <w:tcBorders>
-              <w:top w:val="single" w:sz="4" w:space="0" w:color="000000"/>
-              <w:left w:val="single" w:sz="4" w:space="0" w:color="000000"/>
-              <w:bottom w:val="single" w:sz="4" w:space="0" w:color="000000"/>
-              <w:right w:val="single" w:sz="4" w:space="0" w:color="000000"/>
-            </w:tcBorders>
-          </w:tcPr>
-          <w:p>
-            <w:pPr>
-              <w:spacing w:after="80"/>
-            </w:pPr>
             <w:r>
               <w:t xml:space="preserve"> </w:t>
             </w:r>
-            <w:proofErr w:type="spellStart"/>
-            <w:proofErr w:type="gramStart"/>
-            <w:r>
-              <w:t>faiss:hnsw</w:t>
-            </w:r>
-            <w:proofErr w:type="spellEnd"/>
-            <w:proofErr w:type="gramEnd"/>
-            <w:r>
-              <w:t xml:space="preserve"> (specifically </w:t>
-            </w:r>
-            <w:proofErr w:type="spellStart"/>
-            <w:r>
-              <w:t>IndexHNSWFlat</w:t>
-            </w:r>
-            <w:proofErr w:type="spellEnd"/>
-            <w:r>
-              <w:t xml:space="preserve"> with 32 neighbors) or </w:t>
-            </w:r>
-            <w:proofErr w:type="spellStart"/>
-            <w:proofErr w:type="gramStart"/>
-            <w:r>
-              <w:t>faiss:ivf</w:t>
-            </w:r>
-            <w:proofErr w:type="spellEnd"/>
-            <w:proofErr w:type="gramEnd"/>
-            <w:r>
-              <w:t xml:space="preserve"> depending on chunk count</w:t>
+            <w:r>
+              <w:t>faiss:hnsw (specifically IndexHNSWFlat with 32 neighbors) or faiss:ivf depending on chunk count</w:t>
             </w:r>
           </w:p>
           <w:p>
@@ -3216,61 +2783,25 @@
                 <w:color w:val="000000"/>
                 <w:sz w:val="17"/>
               </w:rPr>
-              <w:t xml:space="preserve">pages → preprocess </w:t>
-            </w:r>
-            <w:proofErr w:type="gramStart"/>
-            <w:r>
+              <w:t>pages → preprocess →  layout → OCR → chunk → embed → store</w:t>
+            </w:r>
+          </w:p>
+          <w:p>
+            <w:pPr>
+              <w:spacing w:after="80"/>
               <w:rPr>
                 <w:rFonts w:ascii="ui-monospace;SFMono-Regular;Men" w:hAnsi="ui-monospace;SFMono-Regular;Men"/>
                 <w:color w:val="000000"/>
                 <w:sz w:val="17"/>
               </w:rPr>
-              <w:t>→  layout</w:t>
-            </w:r>
-            <w:proofErr w:type="gramEnd"/>
+            </w:pPr>
             <w:r>
               <w:rPr>
                 <w:rFonts w:ascii="ui-monospace;SFMono-Regular;Men" w:hAnsi="ui-monospace;SFMono-Regular;Men"/>
                 <w:color w:val="000000"/>
                 <w:sz w:val="17"/>
               </w:rPr>
-              <w:t xml:space="preserve"> → OCR → chunk → embed → store</w:t>
-            </w:r>
-          </w:p>
-          <w:p>
-            <w:pPr>
-              <w:spacing w:after="80"/>
-              <w:rPr>
-                <w:rFonts w:ascii="ui-monospace;SFMono-Regular;Men" w:hAnsi="ui-monospace;SFMono-Regular;Men"/>
-                <w:color w:val="000000"/>
-                <w:sz w:val="17"/>
-              </w:rPr>
-            </w:pPr>
-            <w:r>
-              <w:rPr>
-                <w:rFonts w:ascii="ui-monospace;SFMono-Regular;Men" w:hAnsi="ui-monospace;SFMono-Regular;Men"/>
-                <w:color w:val="000000"/>
-                <w:sz w:val="17"/>
-              </w:rPr>
-              <w:t xml:space="preserve">We only changed the </w:t>
-            </w:r>
-            <w:proofErr w:type="spellStart"/>
-            <w:r>
-              <w:rPr>
-                <w:rFonts w:ascii="ui-monospace;SFMono-Regular;Men" w:hAnsi="ui-monospace;SFMono-Regular;Men"/>
-                <w:color w:val="000000"/>
-                <w:sz w:val="17"/>
-              </w:rPr>
-              <w:t>boolean</w:t>
-            </w:r>
-            <w:proofErr w:type="spellEnd"/>
-            <w:r>
-              <w:rPr>
-                <w:rFonts w:ascii="ui-monospace;SFMono-Regular;Men" w:hAnsi="ui-monospace;SFMono-Regular;Men"/>
-                <w:color w:val="000000"/>
-                <w:sz w:val="17"/>
-              </w:rPr>
-              <w:t xml:space="preserve"> value to false for the enhancement since we are not in need of it.</w:t>
+              <w:t>We only changed the boolean value to false for the enhancement since we are not in need of it.</w:t>
             </w:r>
           </w:p>
         </w:tc>
@@ -3490,17 +3021,7 @@
               <w:t>Index type:</w:t>
             </w:r>
             <w:r>
-              <w:t xml:space="preserve"> </w:t>
-            </w:r>
-            <w:proofErr w:type="spellStart"/>
-            <w:proofErr w:type="gramStart"/>
-            <w:r>
-              <w:t>faiss:hnsw</w:t>
-            </w:r>
-            <w:proofErr w:type="spellEnd"/>
-            <w:proofErr w:type="gramEnd"/>
-            <w:r>
-              <w:t>.</w:t>
+              <w:t xml:space="preserve"> faiss:hnsw.</w:t>
             </w:r>
           </w:p>
         </w:tc>
@@ -3569,80 +3090,66 @@
             <w:r>
               <w:t xml:space="preserve"> "</w:t>
             </w:r>
-            <w:proofErr w:type="spellStart"/>
             <w:r>
               <w:rPr>
                 <w:rFonts w:ascii="Nirmala UI" w:hAnsi="Nirmala UI" w:cs="Nirmala UI"/>
               </w:rPr>
               <w:t>হুনাইন</w:t>
             </w:r>
-            <w:proofErr w:type="spellEnd"/>
             <w:r>
               <w:t xml:space="preserve"> </w:t>
             </w:r>
-            <w:proofErr w:type="spellStart"/>
             <w:r>
               <w:rPr>
                 <w:rFonts w:ascii="Nirmala UI" w:hAnsi="Nirmala UI" w:cs="Nirmala UI"/>
               </w:rPr>
               <w:t>যুদ্ধে</w:t>
             </w:r>
-            <w:proofErr w:type="spellEnd"/>
             <w:r>
               <w:t xml:space="preserve"> </w:t>
             </w:r>
-            <w:proofErr w:type="spellStart"/>
             <w:r>
               <w:rPr>
                 <w:rFonts w:ascii="Nirmala UI" w:hAnsi="Nirmala UI" w:cs="Nirmala UI"/>
               </w:rPr>
               <w:t>মুসলিম</w:t>
             </w:r>
-            <w:proofErr w:type="spellEnd"/>
             <w:r>
               <w:t xml:space="preserve"> </w:t>
             </w:r>
-            <w:proofErr w:type="spellStart"/>
             <w:r>
               <w:rPr>
                 <w:rFonts w:ascii="Nirmala UI" w:hAnsi="Nirmala UI" w:cs="Nirmala UI"/>
               </w:rPr>
               <w:t>বাহিনীর</w:t>
             </w:r>
-            <w:proofErr w:type="spellEnd"/>
             <w:r>
               <w:t xml:space="preserve"> </w:t>
             </w:r>
-            <w:proofErr w:type="spellStart"/>
             <w:r>
               <w:rPr>
                 <w:rFonts w:ascii="Nirmala UI" w:hAnsi="Nirmala UI" w:cs="Nirmala UI"/>
               </w:rPr>
               <w:t>আক্রমণ</w:t>
             </w:r>
-            <w:proofErr w:type="spellEnd"/>
             <w:r>
               <w:t xml:space="preserve"> </w:t>
             </w:r>
-            <w:proofErr w:type="spellStart"/>
             <w:r>
               <w:rPr>
                 <w:rFonts w:ascii="Nirmala UI" w:hAnsi="Nirmala UI" w:cs="Nirmala UI"/>
               </w:rPr>
               <w:t>এবং</w:t>
             </w:r>
-            <w:proofErr w:type="spellEnd"/>
             <w:r>
               <w:t xml:space="preserve"> </w:t>
             </w:r>
-            <w:proofErr w:type="spellStart"/>
             <w:r>
               <w:rPr>
                 <w:rFonts w:ascii="Nirmala UI" w:hAnsi="Nirmala UI" w:cs="Nirmala UI"/>
               </w:rPr>
               <w:t>গণীমত</w:t>
             </w:r>
-            <w:proofErr w:type="spellEnd"/>
             <w:r>
               <w:t xml:space="preserve">". </w:t>
             </w:r>
@@ -3750,15 +3257,7 @@
               <w:t xml:space="preserve"> relatively low (e.g., 0.17 to 0.26) even for correct matches. This is likely because the embedding model (all-MiniLM-L6-v2) is not optimized for Bengali text.</w:t>
             </w:r>
             <w:r>
-              <w:t xml:space="preserve"> </w:t>
-            </w:r>
-            <w:proofErr w:type="gramStart"/>
-            <w:r>
-              <w:t>So</w:t>
-            </w:r>
-            <w:proofErr w:type="gramEnd"/>
-            <w:r>
-              <w:t xml:space="preserve"> we later switched to </w:t>
+              <w:t xml:space="preserve"> So we later switched to </w:t>
             </w:r>
             <w:r>
               <w:rPr>
@@ -3766,6 +3265,16 @@
                 <w:bCs/>
               </w:rPr>
               <w:t>paraphrase-multilingual-MiniLM-L12-v2</w:t>
+            </w:r>
+            <w:r>
+              <w:rPr>
+                <w:b/>
+                <w:bCs/>
+              </w:rPr>
+              <w:t xml:space="preserve"> </w:t>
+            </w:r>
+            <w:r>
+              <w:t>which later raised the score to 0.78 to 0.82</w:t>
             </w:r>
           </w:p>
         </w:tc>
@@ -3846,50 +3355,12 @@
                 <w:sz w:val="18"/>
                 <w:szCs w:val="18"/>
               </w:rPr>
-              <w:t xml:space="preserve">retrieval + </w:t>
-            </w:r>
-            <w:proofErr w:type="spellStart"/>
-            <w:r>
-              <w:rPr>
-                <w:i/>
-                <w:iCs/>
-                <w:color w:val="595959"/>
-                <w:sz w:val="18"/>
-                <w:szCs w:val="18"/>
-              </w:rPr>
-              <w:t>rerank</w:t>
-            </w:r>
-            <w:proofErr w:type="spellEnd"/>
-            <w:r>
-              <w:rPr>
-                <w:i/>
-                <w:iCs/>
-                <w:color w:val="595959"/>
-                <w:sz w:val="18"/>
-                <w:szCs w:val="18"/>
-              </w:rPr>
-              <w:t>, the agent loop + tools, guardrails/HITL, grounding, evaluation — and RL/RLVR if you attempt the bonus.</w:t>
-            </w:r>
-          </w:p>
-          <w:p>
-            <w:r>
-              <w:t xml:space="preserve">Carry the agent forward: in A3 it must do evidence-gated re-search (widen k on weak evidence, abstain at </w:t>
-            </w:r>
-            <w:proofErr w:type="spellStart"/>
-            <w:r>
-              <w:t>k_max</w:t>
-            </w:r>
-            <w:proofErr w:type="spellEnd"/>
-            <w:r>
-              <w:t xml:space="preserve">) — the mandatory agentic </w:t>
-            </w:r>
-            <w:proofErr w:type="spellStart"/>
-            <w:r>
-              <w:t>behaviour</w:t>
-            </w:r>
-            <w:proofErr w:type="spellEnd"/>
-            <w:r>
-              <w:t>, graded fail-closed in A3.</w:t>
+              <w:t>retrieval + rerank, the agent loop + tools, guardrails/HITL, grounding, evaluation — and RL/RLVR if you attempt the bonus.</w:t>
+            </w:r>
+          </w:p>
+          <w:p>
+            <w:r>
+              <w:t>Carry the agent forward: in A3 it must do evidence-gated re-search (widen k on weak evidence, abstain at k_max) — the mandatory agentic behaviour, graded fail-closed in A3.</w:t>
             </w:r>
           </w:p>
         </w:tc>
@@ -3975,31 +3446,7 @@
                 <w:sz w:val="18"/>
                 <w:szCs w:val="18"/>
               </w:rPr>
-              <w:t xml:space="preserve">how you'll write </w:t>
-            </w:r>
-            <w:proofErr w:type="spellStart"/>
-            <w:proofErr w:type="gramStart"/>
-            <w:r>
-              <w:rPr>
-                <w:i/>
-                <w:iCs/>
-                <w:color w:val="595959"/>
-                <w:sz w:val="18"/>
-                <w:szCs w:val="18"/>
-              </w:rPr>
-              <w:t>tasks.jsonl</w:t>
-            </w:r>
-            <w:proofErr w:type="spellEnd"/>
-            <w:proofErr w:type="gramEnd"/>
-            <w:r>
-              <w:rPr>
-                <w:i/>
-                <w:iCs/>
-                <w:color w:val="595959"/>
-                <w:sz w:val="18"/>
-                <w:szCs w:val="18"/>
-              </w:rPr>
-              <w:t xml:space="preserve"> for YOUR domain — the questions your real user would ask; include enough checkable (verifiable) items and abstention cases.</w:t>
+              <w:t>how you'll write tasks.jsonl for YOUR domain — the questions your real user would ask; include enough checkable (verifiable) items and abstention cases.</w:t>
             </w:r>
           </w:p>
         </w:tc>
@@ -4018,17 +3465,7 @@
               <w:spacing w:after="80"/>
             </w:pPr>
             <w:r>
-              <w:t xml:space="preserve">We will construct a </w:t>
-            </w:r>
-            <w:proofErr w:type="spellStart"/>
-            <w:proofErr w:type="gramStart"/>
-            <w:r>
-              <w:t>tasks.jsonl</w:t>
-            </w:r>
-            <w:proofErr w:type="spellEnd"/>
-            <w:proofErr w:type="gramEnd"/>
-            <w:r>
-              <w:t xml:space="preserve"> comprising 50-100 religious and historical QA pairs derived from the Seerah. We will intentionally include 20% "out-of-scope" queries (e.g., events that occurred after the Prophet's timeline) to strictly test the agent's ability to abstain.</w:t>
+              <w:t>We will construct a tasks.jsonl comprising 50-100 religious and historical QA pairs derived from the Seerah. We will intentionally include 20% "out-of-scope" queries (e.g., events that occurred after the Prophet's timeline) to strictly test the agent's ability to abstain.</w:t>
             </w:r>
           </w:p>
           <w:p>
@@ -4120,25 +3557,7 @@
           <w:bCs/>
           <w:color w:val="1F3864"/>
         </w:rPr>
-        <w:t>Section 7 — Design Choices &amp; Justification (knowledge-</w:t>
-      </w:r>
-      <w:proofErr w:type="spellStart"/>
-      <w:r>
-        <w:rPr>
-          <w:b/>
-          <w:bCs/>
-          <w:color w:val="1F3864"/>
-        </w:rPr>
-        <w:t>base</w:t>
-      </w:r>
-      <w:proofErr w:type="spellEnd"/>
-      <w:r>
-        <w:rPr>
-          <w:b/>
-          <w:bCs/>
-          <w:color w:val="1F3864"/>
-        </w:rPr>
-        <w:t xml:space="preserve"> stages)</w:t>
+        <w:t>Section 7 — Design Choices &amp; Justification (knowledge-base stages)</w:t>
       </w:r>
     </w:p>
     <w:p>
@@ -4223,25 +3642,7 @@
                 <w:bCs/>
                 <w:color w:val="FFFFFF"/>
               </w:rPr>
-              <w:t>Our choice across the knowledge-</w:t>
-            </w:r>
-            <w:proofErr w:type="spellStart"/>
-            <w:r>
-              <w:rPr>
-                <w:b/>
-                <w:bCs/>
-                <w:color w:val="FFFFFF"/>
-              </w:rPr>
-              <w:t>base</w:t>
-            </w:r>
-            <w:proofErr w:type="spellEnd"/>
-            <w:r>
-              <w:rPr>
-                <w:b/>
-                <w:bCs/>
-                <w:color w:val="FFFFFF"/>
-              </w:rPr>
-              <w:t xml:space="preserve"> stages</w:t>
+              <w:t>Our choice across the knowledge-base stages</w:t>
             </w:r>
           </w:p>
         </w:tc>
@@ -4313,9 +3714,24 @@
                 <w:sz w:val="18"/>
                 <w:szCs w:val="18"/>
               </w:rPr>
-              <w:t>Convert scanned pages of the Bengali "</w:t>
-            </w:r>
-            <w:proofErr w:type="spellStart"/>
+              <w:t>Convert scanned pages of the Bengali "Ar-Raheequl Makhtum" into clean, chunked text and dense vectors for highly precise retrieval.</w:t>
+            </w:r>
+          </w:p>
+        </w:tc>
+        <w:tc>
+          <w:tcPr>
+            <w:tcW w:w="3760" w:type="dxa"/>
+            <w:tcBorders>
+              <w:top w:val="single" w:sz="4" w:space="0" w:color="000000"/>
+              <w:left w:val="single" w:sz="4" w:space="0" w:color="000000"/>
+              <w:bottom w:val="single" w:sz="4" w:space="0" w:color="000000"/>
+              <w:right w:val="single" w:sz="4" w:space="0" w:color="000000"/>
+            </w:tcBorders>
+          </w:tcPr>
+          <w:p>
+            <w:pPr>
+              <w:spacing w:after="80"/>
+            </w:pPr>
             <w:r>
               <w:rPr>
                 <w:i/>
@@ -4324,9 +3740,46 @@
                 <w:sz w:val="18"/>
                 <w:szCs w:val="18"/>
               </w:rPr>
-              <w:t>Ar-Raheequl</w:t>
-            </w:r>
-            <w:proofErr w:type="spellEnd"/>
+              <w:t>We prioritize precision because religious texts cannot afford hallucinations.</w:t>
+            </w:r>
+          </w:p>
+        </w:tc>
+      </w:tr>
+      <w:tr>
+        <w:tc>
+          <w:tcPr>
+            <w:tcW w:w="2199" w:type="dxa"/>
+            <w:tcBorders>
+              <w:top w:val="single" w:sz="4" w:space="0" w:color="000000"/>
+              <w:left w:val="single" w:sz="4" w:space="0" w:color="000000"/>
+              <w:bottom w:val="single" w:sz="4" w:space="0" w:color="000000"/>
+              <w:right w:val="single" w:sz="4" w:space="0" w:color="000000"/>
+            </w:tcBorders>
+          </w:tcPr>
+          <w:p>
+            <w:pPr>
+              <w:spacing w:after="80"/>
+            </w:pPr>
+            <w:r>
+              <w:lastRenderedPageBreak/>
+              <w:t>Data</w:t>
+            </w:r>
+          </w:p>
+        </w:tc>
+        <w:tc>
+          <w:tcPr>
+            <w:tcW w:w="3401" w:type="dxa"/>
+            <w:tcBorders>
+              <w:top w:val="single" w:sz="4" w:space="0" w:color="000000"/>
+              <w:left w:val="single" w:sz="4" w:space="0" w:color="000000"/>
+              <w:bottom w:val="single" w:sz="4" w:space="0" w:color="000000"/>
+              <w:right w:val="single" w:sz="4" w:space="0" w:color="000000"/>
+            </w:tcBorders>
+          </w:tcPr>
+          <w:p>
+            <w:pPr>
+              <w:spacing w:after="80"/>
+            </w:pPr>
             <w:r>
               <w:rPr>
                 <w:i/>
@@ -4335,9 +3788,24 @@
                 <w:sz w:val="18"/>
                 <w:szCs w:val="18"/>
               </w:rPr>
-              <w:t xml:space="preserve"> </w:t>
-            </w:r>
-            <w:proofErr w:type="spellStart"/>
+              <w:t>Scanned PDF pages rasterized at 150 DPI, stored as JPGs. Outputs map to strictly typed Page, Region, and Chunk objects.</w:t>
+            </w:r>
+          </w:p>
+        </w:tc>
+        <w:tc>
+          <w:tcPr>
+            <w:tcW w:w="3760" w:type="dxa"/>
+            <w:tcBorders>
+              <w:top w:val="single" w:sz="4" w:space="0" w:color="000000"/>
+              <w:left w:val="single" w:sz="4" w:space="0" w:color="000000"/>
+              <w:bottom w:val="single" w:sz="4" w:space="0" w:color="000000"/>
+              <w:right w:val="single" w:sz="4" w:space="0" w:color="000000"/>
+            </w:tcBorders>
+          </w:tcPr>
+          <w:p>
+            <w:pPr>
+              <w:spacing w:after="80"/>
+            </w:pPr>
             <w:r>
               <w:rPr>
                 <w:i/>
@@ -4346,9 +3814,45 @@
                 <w:sz w:val="18"/>
                 <w:szCs w:val="18"/>
               </w:rPr>
-              <w:t>Makhtum</w:t>
-            </w:r>
-            <w:proofErr w:type="spellEnd"/>
+              <w:t>150 DPI balances fast preprocessing and sufficient resolution for YOLO/OCR.</w:t>
+            </w:r>
+          </w:p>
+        </w:tc>
+      </w:tr>
+      <w:tr>
+        <w:tc>
+          <w:tcPr>
+            <w:tcW w:w="2199" w:type="dxa"/>
+            <w:tcBorders>
+              <w:top w:val="single" w:sz="4" w:space="0" w:color="000000"/>
+              <w:left w:val="single" w:sz="4" w:space="0" w:color="000000"/>
+              <w:bottom w:val="single" w:sz="4" w:space="0" w:color="000000"/>
+              <w:right w:val="single" w:sz="4" w:space="0" w:color="000000"/>
+            </w:tcBorders>
+          </w:tcPr>
+          <w:p>
+            <w:pPr>
+              <w:spacing w:after="80"/>
+            </w:pPr>
+            <w:r>
+              <w:t>Model</w:t>
+            </w:r>
+          </w:p>
+        </w:tc>
+        <w:tc>
+          <w:tcPr>
+            <w:tcW w:w="3401" w:type="dxa"/>
+            <w:tcBorders>
+              <w:top w:val="single" w:sz="4" w:space="0" w:color="000000"/>
+              <w:left w:val="single" w:sz="4" w:space="0" w:color="000000"/>
+              <w:bottom w:val="single" w:sz="4" w:space="0" w:color="000000"/>
+              <w:right w:val="single" w:sz="4" w:space="0" w:color="000000"/>
+            </w:tcBorders>
+          </w:tcPr>
+          <w:p>
+            <w:pPr>
+              <w:spacing w:after="80"/>
+            </w:pPr>
             <w:r>
               <w:rPr>
                 <w:i/>
@@ -4357,24 +3861,8 @@
                 <w:sz w:val="18"/>
                 <w:szCs w:val="18"/>
               </w:rPr>
-              <w:t>" into clean, chunked text and dense vectors for highly precise retrieval.</w:t>
-            </w:r>
-          </w:p>
-        </w:tc>
-        <w:tc>
-          <w:tcPr>
-            <w:tcW w:w="3760" w:type="dxa"/>
-            <w:tcBorders>
-              <w:top w:val="single" w:sz="4" w:space="0" w:color="000000"/>
-              <w:left w:val="single" w:sz="4" w:space="0" w:color="000000"/>
-              <w:bottom w:val="single" w:sz="4" w:space="0" w:color="000000"/>
-              <w:right w:val="single" w:sz="4" w:space="0" w:color="000000"/>
-            </w:tcBorders>
-          </w:tcPr>
-          <w:p>
-            <w:pPr>
-              <w:spacing w:after="80"/>
-            </w:pPr>
+              <w:t>hantian/yolo-doclaynet for layout, Tesseract ben_seerah</w:t>
+            </w:r>
             <w:r>
               <w:rPr>
                 <w:i/>
@@ -4383,46 +3871,8 @@
                 <w:sz w:val="18"/>
                 <w:szCs w:val="18"/>
               </w:rPr>
-              <w:t>We prioritize precision because religious texts cannot afford hallucinations.</w:t>
-            </w:r>
-          </w:p>
-        </w:tc>
-      </w:tr>
-      <w:tr>
-        <w:tc>
-          <w:tcPr>
-            <w:tcW w:w="2199" w:type="dxa"/>
-            <w:tcBorders>
-              <w:top w:val="single" w:sz="4" w:space="0" w:color="000000"/>
-              <w:left w:val="single" w:sz="4" w:space="0" w:color="000000"/>
-              <w:bottom w:val="single" w:sz="4" w:space="0" w:color="000000"/>
-              <w:right w:val="single" w:sz="4" w:space="0" w:color="000000"/>
-            </w:tcBorders>
-          </w:tcPr>
-          <w:p>
-            <w:pPr>
-              <w:spacing w:after="80"/>
-            </w:pPr>
-            <w:r>
-              <w:lastRenderedPageBreak/>
-              <w:t>Data</w:t>
-            </w:r>
-          </w:p>
-        </w:tc>
-        <w:tc>
-          <w:tcPr>
-            <w:tcW w:w="3401" w:type="dxa"/>
-            <w:tcBorders>
-              <w:top w:val="single" w:sz="4" w:space="0" w:color="000000"/>
-              <w:left w:val="single" w:sz="4" w:space="0" w:color="000000"/>
-              <w:bottom w:val="single" w:sz="4" w:space="0" w:color="000000"/>
-              <w:right w:val="single" w:sz="4" w:space="0" w:color="000000"/>
-            </w:tcBorders>
-          </w:tcPr>
-          <w:p>
-            <w:pPr>
-              <w:spacing w:after="80"/>
-            </w:pPr>
+              <w:t xml:space="preserve"> (fine tuned)</w:t>
+            </w:r>
             <w:r>
               <w:rPr>
                 <w:i/>
@@ -4431,24 +3881,15 @@
                 <w:sz w:val="18"/>
                 <w:szCs w:val="18"/>
               </w:rPr>
-              <w:t>Scanned PDF pages rasterized at 150 DPI, stored as JPGs. Outputs map to strictly typed Page, Region, and Chunk objects.</w:t>
-            </w:r>
-          </w:p>
-        </w:tc>
-        <w:tc>
-          <w:tcPr>
-            <w:tcW w:w="3760" w:type="dxa"/>
-            <w:tcBorders>
-              <w:top w:val="single" w:sz="4" w:space="0" w:color="000000"/>
-              <w:left w:val="single" w:sz="4" w:space="0" w:color="000000"/>
-              <w:bottom w:val="single" w:sz="4" w:space="0" w:color="000000"/>
-              <w:right w:val="single" w:sz="4" w:space="0" w:color="000000"/>
-            </w:tcBorders>
-          </w:tcPr>
-          <w:p>
-            <w:pPr>
-              <w:spacing w:after="80"/>
-            </w:pPr>
+              <w:t xml:space="preserve"> for OCR, </w:t>
+            </w:r>
+            <w:r>
+              <w:rPr>
+                <w:i/>
+                <w:iCs/>
+              </w:rPr>
+              <w:t>paraphrase-multilingual-MiniLM-L12-v2</w:t>
+            </w:r>
             <w:r>
               <w:rPr>
                 <w:i/>
@@ -4457,46 +3898,24 @@
                 <w:sz w:val="18"/>
                 <w:szCs w:val="18"/>
               </w:rPr>
-              <w:t>150 DPI balances fast preprocessing and sufficient resolution for YOLO/OCR.</w:t>
-            </w:r>
-          </w:p>
-        </w:tc>
-      </w:tr>
-      <w:tr>
-        <w:tc>
-          <w:tcPr>
-            <w:tcW w:w="2199" w:type="dxa"/>
-            <w:tcBorders>
-              <w:top w:val="single" w:sz="4" w:space="0" w:color="000000"/>
-              <w:left w:val="single" w:sz="4" w:space="0" w:color="000000"/>
-              <w:bottom w:val="single" w:sz="4" w:space="0" w:color="000000"/>
-              <w:right w:val="single" w:sz="4" w:space="0" w:color="000000"/>
-            </w:tcBorders>
-          </w:tcPr>
-          <w:p>
-            <w:pPr>
-              <w:spacing w:after="80"/>
-            </w:pPr>
-            <w:r>
-              <w:t>Model</w:t>
-            </w:r>
-          </w:p>
-        </w:tc>
-        <w:tc>
-          <w:tcPr>
-            <w:tcW w:w="3401" w:type="dxa"/>
-            <w:tcBorders>
-              <w:top w:val="single" w:sz="4" w:space="0" w:color="000000"/>
-              <w:left w:val="single" w:sz="4" w:space="0" w:color="000000"/>
-              <w:bottom w:val="single" w:sz="4" w:space="0" w:color="000000"/>
-              <w:right w:val="single" w:sz="4" w:space="0" w:color="000000"/>
-            </w:tcBorders>
-          </w:tcPr>
-          <w:p>
-            <w:pPr>
-              <w:spacing w:after="80"/>
-            </w:pPr>
-            <w:proofErr w:type="spellStart"/>
+              <w:t xml:space="preserve"> for embeddings</w:t>
+            </w:r>
+          </w:p>
+        </w:tc>
+        <w:tc>
+          <w:tcPr>
+            <w:tcW w:w="3760" w:type="dxa"/>
+            <w:tcBorders>
+              <w:top w:val="single" w:sz="4" w:space="0" w:color="000000"/>
+              <w:left w:val="single" w:sz="4" w:space="0" w:color="000000"/>
+              <w:bottom w:val="single" w:sz="4" w:space="0" w:color="000000"/>
+              <w:right w:val="single" w:sz="4" w:space="0" w:color="000000"/>
+            </w:tcBorders>
+          </w:tcPr>
+          <w:p>
+            <w:pPr>
+              <w:spacing w:after="80"/>
+            </w:pPr>
             <w:r>
               <w:rPr>
                 <w:i/>
@@ -4505,9 +3924,45 @@
                 <w:sz w:val="18"/>
                 <w:szCs w:val="18"/>
               </w:rPr>
-              <w:t>hantian</w:t>
-            </w:r>
-            <w:proofErr w:type="spellEnd"/>
+              <w:t>YOLO robustly ignores headers/footers. Tesseract fine-tuned on historical Bengali handles the font complexity better than base models</w:t>
+            </w:r>
+          </w:p>
+        </w:tc>
+      </w:tr>
+      <w:tr>
+        <w:tc>
+          <w:tcPr>
+            <w:tcW w:w="2199" w:type="dxa"/>
+            <w:tcBorders>
+              <w:top w:val="single" w:sz="4" w:space="0" w:color="000000"/>
+              <w:left w:val="single" w:sz="4" w:space="0" w:color="000000"/>
+              <w:bottom w:val="single" w:sz="4" w:space="0" w:color="000000"/>
+              <w:right w:val="single" w:sz="4" w:space="0" w:color="000000"/>
+            </w:tcBorders>
+          </w:tcPr>
+          <w:p>
+            <w:pPr>
+              <w:spacing w:after="80"/>
+            </w:pPr>
+            <w:r>
+              <w:t>Methods</w:t>
+            </w:r>
+          </w:p>
+        </w:tc>
+        <w:tc>
+          <w:tcPr>
+            <w:tcW w:w="3401" w:type="dxa"/>
+            <w:tcBorders>
+              <w:top w:val="single" w:sz="4" w:space="0" w:color="000000"/>
+              <w:left w:val="single" w:sz="4" w:space="0" w:color="000000"/>
+              <w:bottom w:val="single" w:sz="4" w:space="0" w:color="000000"/>
+              <w:right w:val="single" w:sz="4" w:space="0" w:color="000000"/>
+            </w:tcBorders>
+          </w:tcPr>
+          <w:p>
+            <w:pPr>
+              <w:spacing w:after="80"/>
+            </w:pPr>
             <w:r>
               <w:rPr>
                 <w:i/>
@@ -4516,9 +3971,21 @@
                 <w:sz w:val="18"/>
                 <w:szCs w:val="18"/>
               </w:rPr>
-              <w:t>/yolo-</w:t>
-            </w:r>
-            <w:proofErr w:type="spellStart"/>
+              <w:t>PSM 6 for OCR (treating blocks as uniform text), overlapping recursive character chunking (500 size, 50 overlap), FAISS Indexing.</w:t>
+            </w:r>
+          </w:p>
+        </w:tc>
+        <w:tc>
+          <w:tcPr>
+            <w:tcW w:w="3760" w:type="dxa"/>
+            <w:tcBorders>
+              <w:top w:val="single" w:sz="4" w:space="0" w:color="000000"/>
+              <w:left w:val="single" w:sz="4" w:space="0" w:color="000000"/>
+              <w:bottom w:val="single" w:sz="4" w:space="0" w:color="000000"/>
+              <w:right w:val="single" w:sz="4" w:space="0" w:color="000000"/>
+            </w:tcBorders>
+          </w:tcPr>
+          <w:p>
             <w:r>
               <w:rPr>
                 <w:i/>
@@ -4527,9 +3994,45 @@
                 <w:sz w:val="18"/>
                 <w:szCs w:val="18"/>
               </w:rPr>
-              <w:t>doclaynet</w:t>
-            </w:r>
-            <w:proofErr w:type="spellEnd"/>
+              <w:t>Preserves context across paragraphs. Costs minimal compute; easily runs locally.</w:t>
+            </w:r>
+          </w:p>
+        </w:tc>
+      </w:tr>
+      <w:tr>
+        <w:tc>
+          <w:tcPr>
+            <w:tcW w:w="2199" w:type="dxa"/>
+            <w:tcBorders>
+              <w:top w:val="single" w:sz="4" w:space="0" w:color="000000"/>
+              <w:left w:val="single" w:sz="4" w:space="0" w:color="000000"/>
+              <w:bottom w:val="single" w:sz="4" w:space="0" w:color="000000"/>
+              <w:right w:val="single" w:sz="4" w:space="0" w:color="000000"/>
+            </w:tcBorders>
+          </w:tcPr>
+          <w:p>
+            <w:pPr>
+              <w:spacing w:after="80"/>
+            </w:pPr>
+            <w:r>
+              <w:t>Design</w:t>
+            </w:r>
+          </w:p>
+        </w:tc>
+        <w:tc>
+          <w:tcPr>
+            <w:tcW w:w="3401" w:type="dxa"/>
+            <w:tcBorders>
+              <w:top w:val="single" w:sz="4" w:space="0" w:color="000000"/>
+              <w:left w:val="single" w:sz="4" w:space="0" w:color="000000"/>
+              <w:bottom w:val="single" w:sz="4" w:space="0" w:color="000000"/>
+              <w:right w:val="single" w:sz="4" w:space="0" w:color="000000"/>
+            </w:tcBorders>
+          </w:tcPr>
+          <w:p>
+            <w:pPr>
+              <w:spacing w:after="80"/>
+            </w:pPr>
             <w:r>
               <w:rPr>
                 <w:i/>
@@ -4538,9 +4041,24 @@
                 <w:sz w:val="18"/>
                 <w:szCs w:val="18"/>
               </w:rPr>
-              <w:t xml:space="preserve"> for layout, Tesseract </w:t>
-            </w:r>
-            <w:proofErr w:type="spellStart"/>
+              <w:t>Modular, sequential pipeline passing strongly typed dataclasses (e.g., pages -&gt; preprocess -&gt; layout -&gt; OCR -&gt; chunk -&gt; embed -&gt; store).</w:t>
+            </w:r>
+          </w:p>
+        </w:tc>
+        <w:tc>
+          <w:tcPr>
+            <w:tcW w:w="3760" w:type="dxa"/>
+            <w:tcBorders>
+              <w:top w:val="single" w:sz="4" w:space="0" w:color="000000"/>
+              <w:left w:val="single" w:sz="4" w:space="0" w:color="000000"/>
+              <w:bottom w:val="single" w:sz="4" w:space="0" w:color="000000"/>
+              <w:right w:val="single" w:sz="4" w:space="0" w:color="000000"/>
+            </w:tcBorders>
+          </w:tcPr>
+          <w:p>
+            <w:pPr>
+              <w:spacing w:after="80"/>
+            </w:pPr>
             <w:r>
               <w:rPr>
                 <w:i/>
@@ -4549,9 +4067,45 @@
                 <w:sz w:val="18"/>
                 <w:szCs w:val="18"/>
               </w:rPr>
-              <w:t>ben_seerah</w:t>
-            </w:r>
-            <w:proofErr w:type="spellEnd"/>
+              <w:t>Isolates failures. We can swap the embedding or OCR model without breaking the pipeline.</w:t>
+            </w:r>
+          </w:p>
+        </w:tc>
+      </w:tr>
+      <w:tr>
+        <w:tc>
+          <w:tcPr>
+            <w:tcW w:w="2199" w:type="dxa"/>
+            <w:tcBorders>
+              <w:top w:val="single" w:sz="4" w:space="0" w:color="000000"/>
+              <w:left w:val="single" w:sz="4" w:space="0" w:color="000000"/>
+              <w:bottom w:val="single" w:sz="4" w:space="0" w:color="000000"/>
+              <w:right w:val="single" w:sz="4" w:space="0" w:color="000000"/>
+            </w:tcBorders>
+          </w:tcPr>
+          <w:p>
+            <w:pPr>
+              <w:spacing w:after="80"/>
+            </w:pPr>
+            <w:r>
+              <w:t>Development</w:t>
+            </w:r>
+          </w:p>
+        </w:tc>
+        <w:tc>
+          <w:tcPr>
+            <w:tcW w:w="3401" w:type="dxa"/>
+            <w:tcBorders>
+              <w:top w:val="single" w:sz="4" w:space="0" w:color="000000"/>
+              <w:left w:val="single" w:sz="4" w:space="0" w:color="000000"/>
+              <w:bottom w:val="single" w:sz="4" w:space="0" w:color="000000"/>
+              <w:right w:val="single" w:sz="4" w:space="0" w:color="000000"/>
+            </w:tcBorders>
+          </w:tcPr>
+          <w:p>
+            <w:pPr>
+              <w:spacing w:after="80"/>
+            </w:pPr>
             <w:r>
               <w:rPr>
                 <w:i/>
@@ -4560,9 +4114,24 @@
                 <w:sz w:val="18"/>
                 <w:szCs w:val="18"/>
               </w:rPr>
-              <w:t xml:space="preserve"> (</w:t>
-            </w:r>
-            <w:proofErr w:type="spellStart"/>
+              <w:t>Tested using a local Jupyter demo (kb_demo.ipynb) tracking token F1 and vector distance metrics. Used deterministic fallbacks for embeddings.</w:t>
+            </w:r>
+          </w:p>
+        </w:tc>
+        <w:tc>
+          <w:tcPr>
+            <w:tcW w:w="3760" w:type="dxa"/>
+            <w:tcBorders>
+              <w:top w:val="single" w:sz="4" w:space="0" w:color="000000"/>
+              <w:left w:val="single" w:sz="4" w:space="0" w:color="000000"/>
+              <w:bottom w:val="single" w:sz="4" w:space="0" w:color="000000"/>
+              <w:right w:val="single" w:sz="4" w:space="0" w:color="000000"/>
+            </w:tcBorders>
+          </w:tcPr>
+          <w:p>
+            <w:pPr>
+              <w:spacing w:after="80"/>
+            </w:pPr>
             <w:r>
               <w:rPr>
                 <w:i/>
@@ -4571,9 +4140,45 @@
                 <w:sz w:val="18"/>
                 <w:szCs w:val="18"/>
               </w:rPr>
-              <w:t>fine tuned</w:t>
-            </w:r>
-            <w:proofErr w:type="spellEnd"/>
+              <w:t>F1 testing provides a clear baseline for OCR quality before LLMs touch the text</w:t>
+            </w:r>
+          </w:p>
+        </w:tc>
+      </w:tr>
+      <w:tr>
+        <w:tc>
+          <w:tcPr>
+            <w:tcW w:w="2199" w:type="dxa"/>
+            <w:tcBorders>
+              <w:top w:val="single" w:sz="4" w:space="0" w:color="000000"/>
+              <w:left w:val="single" w:sz="4" w:space="0" w:color="000000"/>
+              <w:bottom w:val="single" w:sz="4" w:space="0" w:color="000000"/>
+              <w:right w:val="single" w:sz="4" w:space="0" w:color="000000"/>
+            </w:tcBorders>
+          </w:tcPr>
+          <w:p>
+            <w:pPr>
+              <w:spacing w:after="80"/>
+            </w:pPr>
+            <w:r>
+              <w:t>Deployment</w:t>
+            </w:r>
+          </w:p>
+        </w:tc>
+        <w:tc>
+          <w:tcPr>
+            <w:tcW w:w="3401" w:type="dxa"/>
+            <w:tcBorders>
+              <w:top w:val="single" w:sz="4" w:space="0" w:color="000000"/>
+              <w:left w:val="single" w:sz="4" w:space="0" w:color="000000"/>
+              <w:bottom w:val="single" w:sz="4" w:space="0" w:color="000000"/>
+              <w:right w:val="single" w:sz="4" w:space="0" w:color="000000"/>
+            </w:tcBorders>
+          </w:tcPr>
+          <w:p>
+            <w:pPr>
+              <w:spacing w:after="80"/>
+            </w:pPr>
             <w:r>
               <w:rPr>
                 <w:i/>
@@ -4582,8 +4187,24 @@
                 <w:sz w:val="18"/>
                 <w:szCs w:val="18"/>
               </w:rPr>
-              <w:t>)</w:t>
-            </w:r>
+              <w:t>Python CLI batch execution (scripts/build_index.sh), saving flat vector files (index.faiss, chunks.pkl)</w:t>
+            </w:r>
+          </w:p>
+        </w:tc>
+        <w:tc>
+          <w:tcPr>
+            <w:tcW w:w="3760" w:type="dxa"/>
+            <w:tcBorders>
+              <w:top w:val="single" w:sz="4" w:space="0" w:color="000000"/>
+              <w:left w:val="single" w:sz="4" w:space="0" w:color="000000"/>
+              <w:bottom w:val="single" w:sz="4" w:space="0" w:color="000000"/>
+              <w:right w:val="single" w:sz="4" w:space="0" w:color="000000"/>
+            </w:tcBorders>
+          </w:tcPr>
+          <w:p>
+            <w:pPr>
+              <w:spacing w:after="80"/>
+            </w:pPr>
             <w:r>
               <w:rPr>
                 <w:i/>
@@ -4592,15 +4213,45 @@
                 <w:sz w:val="18"/>
                 <w:szCs w:val="18"/>
               </w:rPr>
-              <w:t xml:space="preserve"> for OCR, </w:t>
-            </w:r>
-            <w:r>
-              <w:rPr>
-                <w:i/>
-                <w:iCs/>
-              </w:rPr>
-              <w:t>paraphrase-multilingual-MiniLM-L12-v2</w:t>
-            </w:r>
+              <w:t>Keeps architecture simple and serverless for milestone evaluation.</w:t>
+            </w:r>
+          </w:p>
+        </w:tc>
+      </w:tr>
+      <w:tr>
+        <w:tc>
+          <w:tcPr>
+            <w:tcW w:w="2199" w:type="dxa"/>
+            <w:tcBorders>
+              <w:top w:val="single" w:sz="4" w:space="0" w:color="000000"/>
+              <w:left w:val="single" w:sz="4" w:space="0" w:color="000000"/>
+              <w:bottom w:val="single" w:sz="4" w:space="0" w:color="000000"/>
+              <w:right w:val="single" w:sz="4" w:space="0" w:color="000000"/>
+            </w:tcBorders>
+          </w:tcPr>
+          <w:p>
+            <w:pPr>
+              <w:spacing w:after="80"/>
+            </w:pPr>
+            <w:r>
+              <w:t>MLOps</w:t>
+            </w:r>
+          </w:p>
+        </w:tc>
+        <w:tc>
+          <w:tcPr>
+            <w:tcW w:w="3401" w:type="dxa"/>
+            <w:tcBorders>
+              <w:top w:val="single" w:sz="4" w:space="0" w:color="000000"/>
+              <w:left w:val="single" w:sz="4" w:space="0" w:color="000000"/>
+              <w:bottom w:val="single" w:sz="4" w:space="0" w:color="000000"/>
+              <w:right w:val="single" w:sz="4" w:space="0" w:color="000000"/>
+            </w:tcBorders>
+          </w:tcPr>
+          <w:p>
+            <w:pPr>
+              <w:spacing w:after="80"/>
+            </w:pPr>
             <w:r>
               <w:rPr>
                 <w:i/>
@@ -4609,497 +4260,7 @@
                 <w:sz w:val="18"/>
                 <w:szCs w:val="18"/>
               </w:rPr>
-              <w:t xml:space="preserve"> for embeddings</w:t>
-            </w:r>
-          </w:p>
-        </w:tc>
-        <w:tc>
-          <w:tcPr>
-            <w:tcW w:w="3760" w:type="dxa"/>
-            <w:tcBorders>
-              <w:top w:val="single" w:sz="4" w:space="0" w:color="000000"/>
-              <w:left w:val="single" w:sz="4" w:space="0" w:color="000000"/>
-              <w:bottom w:val="single" w:sz="4" w:space="0" w:color="000000"/>
-              <w:right w:val="single" w:sz="4" w:space="0" w:color="000000"/>
-            </w:tcBorders>
-          </w:tcPr>
-          <w:p>
-            <w:pPr>
-              <w:spacing w:after="80"/>
-            </w:pPr>
-            <w:r>
-              <w:rPr>
-                <w:i/>
-                <w:iCs/>
-                <w:color w:val="595959"/>
-                <w:sz w:val="18"/>
-                <w:szCs w:val="18"/>
-              </w:rPr>
-              <w:t>YOLO robustly ignores headers/footers. Tesseract fine-tuned on historical Bengali handles the font complexity better than base models</w:t>
-            </w:r>
-          </w:p>
-        </w:tc>
-      </w:tr>
-      <w:tr>
-        <w:tc>
-          <w:tcPr>
-            <w:tcW w:w="2199" w:type="dxa"/>
-            <w:tcBorders>
-              <w:top w:val="single" w:sz="4" w:space="0" w:color="000000"/>
-              <w:left w:val="single" w:sz="4" w:space="0" w:color="000000"/>
-              <w:bottom w:val="single" w:sz="4" w:space="0" w:color="000000"/>
-              <w:right w:val="single" w:sz="4" w:space="0" w:color="000000"/>
-            </w:tcBorders>
-          </w:tcPr>
-          <w:p>
-            <w:pPr>
-              <w:spacing w:after="80"/>
-            </w:pPr>
-            <w:r>
-              <w:t>Methods</w:t>
-            </w:r>
-          </w:p>
-        </w:tc>
-        <w:tc>
-          <w:tcPr>
-            <w:tcW w:w="3401" w:type="dxa"/>
-            <w:tcBorders>
-              <w:top w:val="single" w:sz="4" w:space="0" w:color="000000"/>
-              <w:left w:val="single" w:sz="4" w:space="0" w:color="000000"/>
-              <w:bottom w:val="single" w:sz="4" w:space="0" w:color="000000"/>
-              <w:right w:val="single" w:sz="4" w:space="0" w:color="000000"/>
-            </w:tcBorders>
-          </w:tcPr>
-          <w:p>
-            <w:pPr>
-              <w:spacing w:after="80"/>
-            </w:pPr>
-            <w:r>
-              <w:rPr>
-                <w:i/>
-                <w:iCs/>
-                <w:color w:val="595959"/>
-                <w:sz w:val="18"/>
-                <w:szCs w:val="18"/>
-              </w:rPr>
-              <w:t>PSM 6 for OCR (treating blocks as uniform text), overlapping recursive character chunking (500 size, 50 overlap), FAISS Indexing.</w:t>
-            </w:r>
-          </w:p>
-        </w:tc>
-        <w:tc>
-          <w:tcPr>
-            <w:tcW w:w="3760" w:type="dxa"/>
-            <w:tcBorders>
-              <w:top w:val="single" w:sz="4" w:space="0" w:color="000000"/>
-              <w:left w:val="single" w:sz="4" w:space="0" w:color="000000"/>
-              <w:bottom w:val="single" w:sz="4" w:space="0" w:color="000000"/>
-              <w:right w:val="single" w:sz="4" w:space="0" w:color="000000"/>
-            </w:tcBorders>
-          </w:tcPr>
-          <w:p>
-            <w:r>
-              <w:rPr>
-                <w:i/>
-                <w:iCs/>
-                <w:color w:val="595959"/>
-                <w:sz w:val="18"/>
-                <w:szCs w:val="18"/>
-              </w:rPr>
-              <w:t>Preserves context across paragraphs. Costs minimal compute; easily runs locally.</w:t>
-            </w:r>
-          </w:p>
-        </w:tc>
-      </w:tr>
-      <w:tr>
-        <w:tc>
-          <w:tcPr>
-            <w:tcW w:w="2199" w:type="dxa"/>
-            <w:tcBorders>
-              <w:top w:val="single" w:sz="4" w:space="0" w:color="000000"/>
-              <w:left w:val="single" w:sz="4" w:space="0" w:color="000000"/>
-              <w:bottom w:val="single" w:sz="4" w:space="0" w:color="000000"/>
-              <w:right w:val="single" w:sz="4" w:space="0" w:color="000000"/>
-            </w:tcBorders>
-          </w:tcPr>
-          <w:p>
-            <w:pPr>
-              <w:spacing w:after="80"/>
-            </w:pPr>
-            <w:r>
-              <w:t>Design</w:t>
-            </w:r>
-          </w:p>
-        </w:tc>
-        <w:tc>
-          <w:tcPr>
-            <w:tcW w:w="3401" w:type="dxa"/>
-            <w:tcBorders>
-              <w:top w:val="single" w:sz="4" w:space="0" w:color="000000"/>
-              <w:left w:val="single" w:sz="4" w:space="0" w:color="000000"/>
-              <w:bottom w:val="single" w:sz="4" w:space="0" w:color="000000"/>
-              <w:right w:val="single" w:sz="4" w:space="0" w:color="000000"/>
-            </w:tcBorders>
-          </w:tcPr>
-          <w:p>
-            <w:pPr>
-              <w:spacing w:after="80"/>
-            </w:pPr>
-            <w:r>
-              <w:rPr>
-                <w:i/>
-                <w:iCs/>
-                <w:color w:val="595959"/>
-                <w:sz w:val="18"/>
-                <w:szCs w:val="18"/>
-              </w:rPr>
-              <w:t xml:space="preserve">Modular, sequential pipeline passing strongly typed </w:t>
-            </w:r>
-            <w:proofErr w:type="spellStart"/>
-            <w:r>
-              <w:rPr>
-                <w:i/>
-                <w:iCs/>
-                <w:color w:val="595959"/>
-                <w:sz w:val="18"/>
-                <w:szCs w:val="18"/>
-              </w:rPr>
-              <w:t>dataclasses</w:t>
-            </w:r>
-            <w:proofErr w:type="spellEnd"/>
-            <w:r>
-              <w:rPr>
-                <w:i/>
-                <w:iCs/>
-                <w:color w:val="595959"/>
-                <w:sz w:val="18"/>
-                <w:szCs w:val="18"/>
-              </w:rPr>
-              <w:t xml:space="preserve"> (e.g., pages -&gt; preprocess -&gt; layout -&gt; OCR -&gt; chunk -&gt; embed -&gt; store).</w:t>
-            </w:r>
-          </w:p>
-        </w:tc>
-        <w:tc>
-          <w:tcPr>
-            <w:tcW w:w="3760" w:type="dxa"/>
-            <w:tcBorders>
-              <w:top w:val="single" w:sz="4" w:space="0" w:color="000000"/>
-              <w:left w:val="single" w:sz="4" w:space="0" w:color="000000"/>
-              <w:bottom w:val="single" w:sz="4" w:space="0" w:color="000000"/>
-              <w:right w:val="single" w:sz="4" w:space="0" w:color="000000"/>
-            </w:tcBorders>
-          </w:tcPr>
-          <w:p>
-            <w:pPr>
-              <w:spacing w:after="80"/>
-            </w:pPr>
-            <w:r>
-              <w:rPr>
-                <w:i/>
-                <w:iCs/>
-                <w:color w:val="595959"/>
-                <w:sz w:val="18"/>
-                <w:szCs w:val="18"/>
-              </w:rPr>
-              <w:t>Isolates failures. We can swap the embedding or OCR model without breaking the pipeline.</w:t>
-            </w:r>
-          </w:p>
-        </w:tc>
-      </w:tr>
-      <w:tr>
-        <w:tc>
-          <w:tcPr>
-            <w:tcW w:w="2199" w:type="dxa"/>
-            <w:tcBorders>
-              <w:top w:val="single" w:sz="4" w:space="0" w:color="000000"/>
-              <w:left w:val="single" w:sz="4" w:space="0" w:color="000000"/>
-              <w:bottom w:val="single" w:sz="4" w:space="0" w:color="000000"/>
-              <w:right w:val="single" w:sz="4" w:space="0" w:color="000000"/>
-            </w:tcBorders>
-          </w:tcPr>
-          <w:p>
-            <w:pPr>
-              <w:spacing w:after="80"/>
-            </w:pPr>
-            <w:r>
-              <w:t>Development</w:t>
-            </w:r>
-          </w:p>
-        </w:tc>
-        <w:tc>
-          <w:tcPr>
-            <w:tcW w:w="3401" w:type="dxa"/>
-            <w:tcBorders>
-              <w:top w:val="single" w:sz="4" w:space="0" w:color="000000"/>
-              <w:left w:val="single" w:sz="4" w:space="0" w:color="000000"/>
-              <w:bottom w:val="single" w:sz="4" w:space="0" w:color="000000"/>
-              <w:right w:val="single" w:sz="4" w:space="0" w:color="000000"/>
-            </w:tcBorders>
-          </w:tcPr>
-          <w:p>
-            <w:pPr>
-              <w:spacing w:after="80"/>
-            </w:pPr>
-            <w:r>
-              <w:rPr>
-                <w:i/>
-                <w:iCs/>
-                <w:color w:val="595959"/>
-                <w:sz w:val="18"/>
-                <w:szCs w:val="18"/>
-              </w:rPr>
-              <w:t>Tested using a local Jupyter demo (</w:t>
-            </w:r>
-            <w:proofErr w:type="spellStart"/>
-            <w:r>
-              <w:rPr>
-                <w:i/>
-                <w:iCs/>
-                <w:color w:val="595959"/>
-                <w:sz w:val="18"/>
-                <w:szCs w:val="18"/>
-              </w:rPr>
-              <w:t>kb_</w:t>
-            </w:r>
-            <w:proofErr w:type="gramStart"/>
-            <w:r>
-              <w:rPr>
-                <w:i/>
-                <w:iCs/>
-                <w:color w:val="595959"/>
-                <w:sz w:val="18"/>
-                <w:szCs w:val="18"/>
-              </w:rPr>
-              <w:t>demo.ipynb</w:t>
-            </w:r>
-            <w:proofErr w:type="spellEnd"/>
-            <w:proofErr w:type="gramEnd"/>
-            <w:r>
-              <w:rPr>
-                <w:i/>
-                <w:iCs/>
-                <w:color w:val="595959"/>
-                <w:sz w:val="18"/>
-                <w:szCs w:val="18"/>
-              </w:rPr>
-              <w:t>) tracking token F1 and vector distance metrics. Used deterministic fallbacks for embeddings.</w:t>
-            </w:r>
-          </w:p>
-        </w:tc>
-        <w:tc>
-          <w:tcPr>
-            <w:tcW w:w="3760" w:type="dxa"/>
-            <w:tcBorders>
-              <w:top w:val="single" w:sz="4" w:space="0" w:color="000000"/>
-              <w:left w:val="single" w:sz="4" w:space="0" w:color="000000"/>
-              <w:bottom w:val="single" w:sz="4" w:space="0" w:color="000000"/>
-              <w:right w:val="single" w:sz="4" w:space="0" w:color="000000"/>
-            </w:tcBorders>
-          </w:tcPr>
-          <w:p>
-            <w:pPr>
-              <w:spacing w:after="80"/>
-            </w:pPr>
-            <w:r>
-              <w:rPr>
-                <w:i/>
-                <w:iCs/>
-                <w:color w:val="595959"/>
-                <w:sz w:val="18"/>
-                <w:szCs w:val="18"/>
-              </w:rPr>
-              <w:t>F1 testing provides a clear baseline for OCR quality before LLMs touch the text</w:t>
-            </w:r>
-          </w:p>
-        </w:tc>
-      </w:tr>
-      <w:tr>
-        <w:tc>
-          <w:tcPr>
-            <w:tcW w:w="2199" w:type="dxa"/>
-            <w:tcBorders>
-              <w:top w:val="single" w:sz="4" w:space="0" w:color="000000"/>
-              <w:left w:val="single" w:sz="4" w:space="0" w:color="000000"/>
-              <w:bottom w:val="single" w:sz="4" w:space="0" w:color="000000"/>
-              <w:right w:val="single" w:sz="4" w:space="0" w:color="000000"/>
-            </w:tcBorders>
-          </w:tcPr>
-          <w:p>
-            <w:pPr>
-              <w:spacing w:after="80"/>
-            </w:pPr>
-            <w:r>
-              <w:t>Deployment</w:t>
-            </w:r>
-          </w:p>
-        </w:tc>
-        <w:tc>
-          <w:tcPr>
-            <w:tcW w:w="3401" w:type="dxa"/>
-            <w:tcBorders>
-              <w:top w:val="single" w:sz="4" w:space="0" w:color="000000"/>
-              <w:left w:val="single" w:sz="4" w:space="0" w:color="000000"/>
-              <w:bottom w:val="single" w:sz="4" w:space="0" w:color="000000"/>
-              <w:right w:val="single" w:sz="4" w:space="0" w:color="000000"/>
-            </w:tcBorders>
-          </w:tcPr>
-          <w:p>
-            <w:pPr>
-              <w:spacing w:after="80"/>
-            </w:pPr>
-            <w:r>
-              <w:rPr>
-                <w:i/>
-                <w:iCs/>
-                <w:color w:val="595959"/>
-                <w:sz w:val="18"/>
-                <w:szCs w:val="18"/>
-              </w:rPr>
-              <w:t>Python CLI batch execution (scripts/build_index.sh), saving flat vector files (</w:t>
-            </w:r>
-            <w:proofErr w:type="spellStart"/>
-            <w:proofErr w:type="gramStart"/>
-            <w:r>
-              <w:rPr>
-                <w:i/>
-                <w:iCs/>
-                <w:color w:val="595959"/>
-                <w:sz w:val="18"/>
-                <w:szCs w:val="18"/>
-              </w:rPr>
-              <w:t>index.faiss</w:t>
-            </w:r>
-            <w:proofErr w:type="spellEnd"/>
-            <w:proofErr w:type="gramEnd"/>
-            <w:r>
-              <w:rPr>
-                <w:i/>
-                <w:iCs/>
-                <w:color w:val="595959"/>
-                <w:sz w:val="18"/>
-                <w:szCs w:val="18"/>
-              </w:rPr>
-              <w:t xml:space="preserve">, </w:t>
-            </w:r>
-            <w:proofErr w:type="spellStart"/>
-            <w:r>
-              <w:rPr>
-                <w:i/>
-                <w:iCs/>
-                <w:color w:val="595959"/>
-                <w:sz w:val="18"/>
-                <w:szCs w:val="18"/>
-              </w:rPr>
-              <w:t>chunks.pkl</w:t>
-            </w:r>
-            <w:proofErr w:type="spellEnd"/>
-            <w:r>
-              <w:rPr>
-                <w:i/>
-                <w:iCs/>
-                <w:color w:val="595959"/>
-                <w:sz w:val="18"/>
-                <w:szCs w:val="18"/>
-              </w:rPr>
-              <w:t>)</w:t>
-            </w:r>
-          </w:p>
-        </w:tc>
-        <w:tc>
-          <w:tcPr>
-            <w:tcW w:w="3760" w:type="dxa"/>
-            <w:tcBorders>
-              <w:top w:val="single" w:sz="4" w:space="0" w:color="000000"/>
-              <w:left w:val="single" w:sz="4" w:space="0" w:color="000000"/>
-              <w:bottom w:val="single" w:sz="4" w:space="0" w:color="000000"/>
-              <w:right w:val="single" w:sz="4" w:space="0" w:color="000000"/>
-            </w:tcBorders>
-          </w:tcPr>
-          <w:p>
-            <w:pPr>
-              <w:spacing w:after="80"/>
-            </w:pPr>
-            <w:r>
-              <w:rPr>
-                <w:i/>
-                <w:iCs/>
-                <w:color w:val="595959"/>
-                <w:sz w:val="18"/>
-                <w:szCs w:val="18"/>
-              </w:rPr>
-              <w:t>Keeps architecture simple and serverless for milestone evaluation.</w:t>
-            </w:r>
-          </w:p>
-        </w:tc>
-      </w:tr>
-      <w:tr>
-        <w:tc>
-          <w:tcPr>
-            <w:tcW w:w="2199" w:type="dxa"/>
-            <w:tcBorders>
-              <w:top w:val="single" w:sz="4" w:space="0" w:color="000000"/>
-              <w:left w:val="single" w:sz="4" w:space="0" w:color="000000"/>
-              <w:bottom w:val="single" w:sz="4" w:space="0" w:color="000000"/>
-              <w:right w:val="single" w:sz="4" w:space="0" w:color="000000"/>
-            </w:tcBorders>
-          </w:tcPr>
-          <w:p>
-            <w:pPr>
-              <w:spacing w:after="80"/>
-            </w:pPr>
-            <w:proofErr w:type="spellStart"/>
-            <w:r>
-              <w:t>MLOps</w:t>
-            </w:r>
-            <w:proofErr w:type="spellEnd"/>
-          </w:p>
-        </w:tc>
-        <w:tc>
-          <w:tcPr>
-            <w:tcW w:w="3401" w:type="dxa"/>
-            <w:tcBorders>
-              <w:top w:val="single" w:sz="4" w:space="0" w:color="000000"/>
-              <w:left w:val="single" w:sz="4" w:space="0" w:color="000000"/>
-              <w:bottom w:val="single" w:sz="4" w:space="0" w:color="000000"/>
-              <w:right w:val="single" w:sz="4" w:space="0" w:color="000000"/>
-            </w:tcBorders>
-          </w:tcPr>
-          <w:p>
-            <w:pPr>
-              <w:spacing w:after="80"/>
-            </w:pPr>
-            <w:r>
-              <w:rPr>
-                <w:i/>
-                <w:iCs/>
-                <w:color w:val="595959"/>
-                <w:sz w:val="18"/>
-                <w:szCs w:val="18"/>
-              </w:rPr>
-              <w:t xml:space="preserve">Configuration stored in </w:t>
-            </w:r>
-            <w:proofErr w:type="spellStart"/>
-            <w:proofErr w:type="gramStart"/>
-            <w:r>
-              <w:rPr>
-                <w:i/>
-                <w:iCs/>
-                <w:color w:val="595959"/>
-                <w:sz w:val="18"/>
-                <w:szCs w:val="18"/>
-              </w:rPr>
-              <w:t>config.yaml</w:t>
-            </w:r>
-            <w:proofErr w:type="spellEnd"/>
-            <w:proofErr w:type="gramEnd"/>
-            <w:r>
-              <w:rPr>
-                <w:i/>
-                <w:iCs/>
-                <w:color w:val="595959"/>
-                <w:sz w:val="18"/>
-                <w:szCs w:val="18"/>
-              </w:rPr>
-              <w:t xml:space="preserve"> with explicit model paths (e.g., TESSDATA_PREFIX).</w:t>
+              <w:t>Configuration stored in config.yaml with explicit model paths (e.g., TESSDATA_PREFIX).</w:t>
             </w:r>
           </w:p>
         </w:tc>
@@ -5392,15 +4553,7 @@
         <w:spacing w:after="100"/>
       </w:pPr>
       <w:r>
-        <w:t xml:space="preserve">The </w:t>
-      </w:r>
-      <w:proofErr w:type="spellStart"/>
-      <w:r>
-        <w:t>autograder</w:t>
-      </w:r>
-      <w:proofErr w:type="spellEnd"/>
-      <w:r>
-        <w:t xml:space="preserve"> enforces this exactly. ZIP named </w:t>
+        <w:t xml:space="preserve">The autograder enforces this exactly. ZIP named </w:t>
       </w:r>
       <w:r>
         <w:rPr>
@@ -5536,26 +4689,8 @@
             <w:pPr>
               <w:spacing w:after="80"/>
             </w:pPr>
-            <w:proofErr w:type="spellStart"/>
-            <w:r>
-              <w:t>src</w:t>
-            </w:r>
-            <w:proofErr w:type="spellEnd"/>
-            <w:r>
-              <w:t>/</w:t>
-            </w:r>
-            <w:proofErr w:type="spellStart"/>
-            <w:r>
-              <w:t>doc_agent</w:t>
-            </w:r>
-            <w:proofErr w:type="spellEnd"/>
-            <w:proofErr w:type="gramStart"/>
-            <w:r>
-              <w:t>/  (</w:t>
-            </w:r>
-            <w:proofErr w:type="gramEnd"/>
-            <w:r>
-              <w:t>ingest, vision, index)</w:t>
+            <w:r>
+              <w:t>src/doc_agent/  (ingest, vision, index)</w:t>
             </w:r>
           </w:p>
         </w:tc>
@@ -5574,15 +4709,7 @@
               <w:spacing w:after="80"/>
             </w:pPr>
             <w:r>
-              <w:t>the implemented knowledge-</w:t>
-            </w:r>
-            <w:proofErr w:type="spellStart"/>
-            <w:r>
-              <w:t>base</w:t>
-            </w:r>
-            <w:proofErr w:type="spellEnd"/>
-            <w:r>
-              <w:t xml:space="preserve"> stages</w:t>
+              <w:t>the implemented knowledge-base stages</w:t>
             </w:r>
           </w:p>
         </w:tc>
@@ -5643,13 +4770,8 @@
               <w:spacing w:after="80"/>
             </w:pPr>
             <w:r>
-              <w:t>notebooks/</w:t>
-            </w:r>
-            <w:proofErr w:type="spellStart"/>
-            <w:r>
-              <w:t>kb_demo.ipynb</w:t>
-            </w:r>
-            <w:proofErr w:type="spellEnd"/>
+              <w:t>notebooks/kb_demo.ipynb</w:t>
+            </w:r>
           </w:p>
         </w:tc>
         <w:tc>
@@ -5707,15 +4829,7 @@
               <w:spacing w:after="80"/>
             </w:pPr>
             <w:r>
-              <w:t>a diagram of the knowledge-</w:t>
-            </w:r>
-            <w:proofErr w:type="spellStart"/>
-            <w:r>
-              <w:t>base</w:t>
-            </w:r>
-            <w:proofErr w:type="spellEnd"/>
-            <w:r>
-              <w:t xml:space="preserve"> pipeline (edit the stub)</w:t>
+              <w:t>a diagram of the knowledge-base pipeline (edit the stub)</w:t>
             </w:r>
           </w:p>
         </w:tc>
@@ -5777,15 +4891,7 @@
             </w:pPr>
             <w:r>
               <w:lastRenderedPageBreak/>
-              <w:t>transcripts/&lt;student number&gt;.</w:t>
-            </w:r>
-            <w:proofErr w:type="gramStart"/>
-            <w:r>
-              <w:t>txt  ×</w:t>
-            </w:r>
-            <w:proofErr w:type="gramEnd"/>
-            <w:r>
-              <w:t>3</w:t>
+              <w:t>transcripts/&lt;student number&gt;.txt  ×3</w:t>
             </w:r>
           </w:p>
         </w:tc>
@@ -6740,6 +5846,7 @@
   <w:style w:type="character" w:default="1" w:styleId="DefaultParagraphFont">
     <w:name w:val="Default Paragraph Font"/>
     <w:uiPriority w:val="1"/>
+    <w:semiHidden/>
     <w:unhideWhenUsed/>
   </w:style>
   <w:style w:type="table" w:default="1" w:styleId="TableNormal">

</xml_diff>